<commit_message>
add manual de usuario
</commit_message>
<xml_diff>
--- a/docs/descripcion_tablero_funcional.docx
+++ b/docs/descripcion_tablero_funcional.docx
@@ -25,10 +25,10 @@
     </w:p>
     <w:p>
       <w:pPr>
-        <w:spacing w:after="120" w:line="259" w:lineRule="auto"/>
+        <w:spacing w:after="140" w:line="259" w:lineRule="auto"/>
       </w:pPr>
       <w:r>
-        <w:t>Este documento describe la funcionalidad del dashboard desarrollado para el prototipo MAIA News Analyzer. El tablero permite que un usuario ingrese una noticia, ejecute una predicción mediante el backend y revise la orientación política estimada junto con probabilidades y elementos de contexto. Su objetivo es convertir el modelo analítico en una herramienta usable dentro de una aplicación web.</w:t>
+        <w:t>Este documento describe el tablero funcional de MAIA News Analyzer en su estado actual. La interfaz permite que una persona ingrese el título opcional y el cuerpo de una noticia, ejecute una predicción contra el servicio de backend y revise la orientación política estimada junto con sus probabilidades. El tablero también incorpora estados de operación para carga, errores, respuestas inválidas, resultados pendientes y predicciones con baja confianza, de modo que el usuario no confunda una salida incompleta con una conclusión del modelo.</w:t>
       </w:r>
     </w:p>
     <w:p>
@@ -41,10 +41,10 @@
     </w:p>
     <w:p>
       <w:pPr>
-        <w:spacing w:after="120" w:line="259" w:lineRule="auto"/>
+        <w:spacing w:after="140" w:line="259" w:lineRule="auto"/>
       </w:pPr>
       <w:r>
-        <w:t>El tablero responde a la necesidad de analizar noticias desde una interfaz clara para el usuario final. En lugar de limitarse a mostrar una maqueta estática, la pantalla principal conecta el frontend con la API del backend y presenta una salida interpretable del modelo. Esto permite validar el flujo completo del producto: entrada de datos, procesamiento, inferencia y visualización del resultado.</w:t>
+        <w:t>El tablero convierte el modelo de clasificación de perspectiva política en una experiencia operable dentro de una aplicación web. Su propósito es facilitar el flujo completo de análisis: recepción de la noticia, solicitud de predicción, presentación de la clase estimada y lectura de elementos de contexto. La pantalla está pensada para una validación clara del prototipo, no para exponer detalles internos de implementación al usuario final.</w:t>
       </w:r>
     </w:p>
     <w:p>
@@ -52,7 +52,7 @@
         <w:pStyle w:val="Heading1"/>
       </w:pPr>
       <w:r>
-        <w:t>Flujo funcional</w:t>
+        <w:t>Pantalla principal</w:t>
       </w:r>
     </w:p>
     <w:p>
@@ -61,7 +61,7 @@
         <w:spacing w:after="80" w:line="252" w:lineRule="auto"/>
       </w:pPr>
       <w:r>
-        <w:t>El usuario ingresa el titulo opcional y el cuerpo completo de la noticia en el formulario del dashboard.</w:t>
+        <w:t>El encabezado identifica el producto y ofrece acceso a la vista de exploración de datos.</w:t>
       </w:r>
     </w:p>
     <w:p>
@@ -70,7 +70,7 @@
         <w:spacing w:after="80" w:line="252" w:lineRule="auto"/>
       </w:pPr>
       <w:r>
-        <w:t>Al seleccionar la acción de predicción, el frontend envía la información al endpoint POST /api/predict.</w:t>
+        <w:t>Los indicadores superiores muestran el endpoint usado, el estado o clase estimada y la cantidad de análisis registrados.</w:t>
       </w:r>
     </w:p>
     <w:p>
@@ -79,7 +79,7 @@
         <w:spacing w:after="80" w:line="252" w:lineRule="auto"/>
       </w:pPr>
       <w:r>
-        <w:t>El backend procesa la solicitud y devuelve un identificador de resultado, una clase estimada y probabilidades para CENTER, LEFT y RIGHT.</w:t>
+        <w:t>El panel de entrada permite escribir o pegar el título y el texto completo de la noticia.</w:t>
       </w:r>
     </w:p>
     <w:p>
@@ -88,7 +88,7 @@
         <w:spacing w:after="80" w:line="252" w:lineRule="auto"/>
       </w:pPr>
       <w:r>
-        <w:t>El dashboard muestra la orientación dominante, el porcentaje de confianza calculado a partir de las probabilidades y las barras comparativas por clase.</w:t>
+        <w:t>El panel de resultado permanece en estado pendiente hasta que se ejecute una predicción real.</w:t>
       </w:r>
     </w:p>
     <w:p>
@@ -97,7 +97,7 @@
         <w:spacing w:after="80" w:line="252" w:lineRule="auto"/>
       </w:pPr>
       <w:r>
-        <w:t>La interfaz conserva datos de apoyo como historial reciente, variables explicativas y acceso a vistas de exploración para dar contexto al resultado.</w:t>
+        <w:t>Las secciones inferiores muestran cumplimiento del prototipo, variables explicativas e historial reciente cuando hay datos disponibles.</w:t>
       </w:r>
     </w:p>
     <w:p>
@@ -105,17 +105,888 @@
         <w:pStyle w:val="Heading1"/>
       </w:pPr>
       <w:r>
-        <w:t>Conexión con el backend</w:t>
+        <w:t>Flujo funcional de predicción</w:t>
       </w:r>
     </w:p>
     <w:p>
       <w:pPr>
-        <w:spacing w:after="120" w:line="259" w:lineRule="auto"/>
+        <w:pStyle w:val="ListNumber"/>
+        <w:spacing w:after="80" w:line="252" w:lineRule="auto"/>
       </w:pPr>
       <w:r>
-        <w:t>La funcionalidad principal del dashboard se apoya en el endpoint POST /api/predict. El frontend envía un objeto JSON con los campos titulo y texto, donde texto corresponde al cuerpo de la noticia. La respuesta esperada incluye un id de predicción, la clase reportada por la API y el objeto probabilidades con los valores center, left y right. Esta integración evidencia que el tablero emplea el modelo a través de una API, tal como se solicita para el prototipo funcional.</w:t>
+        <w:t>El usuario ingresa el cuerpo de la noticia y, si lo desea, un título.</w:t>
       </w:r>
     </w:p>
+    <w:p>
+      <w:pPr>
+        <w:pStyle w:val="ListNumber"/>
+        <w:spacing w:after="80" w:line="252" w:lineRule="auto"/>
+      </w:pPr>
+      <w:r>
+        <w:t>Al seleccionar la acción de predicción, la interfaz envía la solicitud al servicio del backend.</w:t>
+      </w:r>
+    </w:p>
+    <w:p>
+      <w:pPr>
+        <w:pStyle w:val="ListNumber"/>
+        <w:spacing w:after="80" w:line="252" w:lineRule="auto"/>
+      </w:pPr>
+      <w:r>
+        <w:t>Mientras espera la respuesta, el tablero muestra el estado de consulta en curso.</w:t>
+      </w:r>
+    </w:p>
+    <w:p>
+      <w:pPr>
+        <w:pStyle w:val="ListNumber"/>
+        <w:spacing w:after="80" w:line="252" w:lineRule="auto"/>
+      </w:pPr>
+      <w:r>
+        <w:t>Si la respuesta es válida, se muestran la clase dominante, el identificador de predicción, la clase reportada por la API y las probabilidades de LEFT, CENTER y RIGHT.</w:t>
+      </w:r>
+    </w:p>
+    <w:p>
+      <w:pPr>
+        <w:pStyle w:val="ListNumber"/>
+        <w:spacing w:after="80" w:line="252" w:lineRule="auto"/>
+      </w:pPr>
+      <w:r>
+        <w:t>Si la confianza es baja, el tablero muestra una advertencia para que el usuario revise las probabilidades antes de interpretar el resultado como concluyente.</w:t>
+      </w:r>
+    </w:p>
+    <w:p>
+      <w:pPr>
+        <w:pStyle w:val="Heading1"/>
+      </w:pPr>
+      <w:r>
+        <w:t>Estados manejados por la interfaz</w:t>
+      </w:r>
+    </w:p>
+    <w:tbl>
+      <w:tblPr>
+        <w:tblStyle w:val="TableGrid"/>
+        <w:tblW w:type="auto" w:w="0"/>
+        <w:tblLayout w:type="autofit"/>
+        <w:tblLook w:firstColumn="1" w:firstRow="1" w:lastColumn="0" w:lastRow="0" w:noHBand="0" w:noVBand="1" w:val="04A0"/>
+      </w:tblPr>
+      <w:tblGrid>
+        <w:gridCol w:w="3293"/>
+        <w:gridCol w:w="3293"/>
+        <w:gridCol w:w="3293"/>
+      </w:tblGrid>
+      <w:tr>
+        <w:trPr>
+          <w:cantSplit/>
+        </w:trPr>
+        <w:tc>
+          <w:tcPr>
+            <w:tcW w:type="dxa" w:w="2088"/>
+            <w:shd w:fill="0F172A"/>
+            <w:tcBorders>
+              <w:top w:val="single" w:sz="6" w:space="0" w:color="D9D9D9"/>
+              <w:left w:val="single" w:sz="6" w:space="0" w:color="D9D9D9"/>
+              <w:bottom w:val="single" w:sz="6" w:space="0" w:color="D9D9D9"/>
+              <w:right w:val="single" w:sz="6" w:space="0" w:color="D9D9D9"/>
+              <w:insideH w:val="single" w:sz="6" w:space="0" w:color="D9D9D9"/>
+              <w:insideV w:val="single" w:sz="6" w:space="0" w:color="D9D9D9"/>
+            </w:tcBorders>
+            <w:tcMar>
+              <w:top w:w="100" w:type="dxa"/>
+              <w:start w:w="120" w:type="dxa"/>
+              <w:bottom w:w="100" w:type="dxa"/>
+              <w:end w:w="120" w:type="dxa"/>
+            </w:tcMar>
+            <w:vAlign w:val="center"/>
+          </w:tcPr>
+          <w:p>
+            <w:pPr>
+              <w:spacing w:after="0"/>
+              <w:jc w:val="center"/>
+            </w:pPr>
+            <w:r>
+              <w:rPr>
+                <w:b/>
+                <w:color w:val="FFFFFF"/>
+                <w:sz w:val="19"/>
+              </w:rPr>
+              <w:t>Estado</w:t>
+            </w:r>
+          </w:p>
+        </w:tc>
+        <w:tc>
+          <w:tcPr>
+            <w:tcW w:type="dxa" w:w="3384"/>
+            <w:shd w:fill="0F172A"/>
+            <w:tcBorders>
+              <w:top w:val="single" w:sz="6" w:space="0" w:color="D9D9D9"/>
+              <w:left w:val="single" w:sz="6" w:space="0" w:color="D9D9D9"/>
+              <w:bottom w:val="single" w:sz="6" w:space="0" w:color="D9D9D9"/>
+              <w:right w:val="single" w:sz="6" w:space="0" w:color="D9D9D9"/>
+              <w:insideH w:val="single" w:sz="6" w:space="0" w:color="D9D9D9"/>
+              <w:insideV w:val="single" w:sz="6" w:space="0" w:color="D9D9D9"/>
+            </w:tcBorders>
+            <w:tcMar>
+              <w:top w:w="100" w:type="dxa"/>
+              <w:start w:w="120" w:type="dxa"/>
+              <w:bottom w:w="100" w:type="dxa"/>
+              <w:end w:w="120" w:type="dxa"/>
+            </w:tcMar>
+            <w:vAlign w:val="center"/>
+          </w:tcPr>
+          <w:p>
+            <w:pPr>
+              <w:spacing w:after="0"/>
+              <w:jc w:val="center"/>
+            </w:pPr>
+            <w:r>
+              <w:rPr>
+                <w:b/>
+                <w:color w:val="FFFFFF"/>
+                <w:sz w:val="19"/>
+              </w:rPr>
+              <w:t>Cómo se presenta</w:t>
+            </w:r>
+          </w:p>
+        </w:tc>
+        <w:tc>
+          <w:tcPr>
+            <w:tcW w:type="dxa" w:w="3672"/>
+            <w:shd w:fill="0F172A"/>
+            <w:tcBorders>
+              <w:top w:val="single" w:sz="6" w:space="0" w:color="D9D9D9"/>
+              <w:left w:val="single" w:sz="6" w:space="0" w:color="D9D9D9"/>
+              <w:bottom w:val="single" w:sz="6" w:space="0" w:color="D9D9D9"/>
+              <w:right w:val="single" w:sz="6" w:space="0" w:color="D9D9D9"/>
+              <w:insideH w:val="single" w:sz="6" w:space="0" w:color="D9D9D9"/>
+              <w:insideV w:val="single" w:sz="6" w:space="0" w:color="D9D9D9"/>
+            </w:tcBorders>
+            <w:tcMar>
+              <w:top w:w="100" w:type="dxa"/>
+              <w:start w:w="120" w:type="dxa"/>
+              <w:bottom w:w="100" w:type="dxa"/>
+              <w:end w:w="120" w:type="dxa"/>
+            </w:tcMar>
+            <w:vAlign w:val="center"/>
+          </w:tcPr>
+          <w:p>
+            <w:pPr>
+              <w:spacing w:after="0"/>
+              <w:jc w:val="center"/>
+            </w:pPr>
+            <w:r>
+              <w:rPr>
+                <w:b/>
+                <w:color w:val="FFFFFF"/>
+                <w:sz w:val="19"/>
+              </w:rPr>
+              <w:t>Finalidad</w:t>
+            </w:r>
+          </w:p>
+        </w:tc>
+      </w:tr>
+      <w:tr>
+        <w:trPr>
+          <w:cantSplit/>
+        </w:trPr>
+        <w:tc>
+          <w:tcPr>
+            <w:tcW w:type="dxa" w:w="3293"/>
+            <w:tcBorders>
+              <w:top w:val="single" w:sz="6" w:space="0" w:color="D9D9D9"/>
+              <w:left w:val="single" w:sz="6" w:space="0" w:color="D9D9D9"/>
+              <w:bottom w:val="single" w:sz="6" w:space="0" w:color="D9D9D9"/>
+              <w:right w:val="single" w:sz="6" w:space="0" w:color="D9D9D9"/>
+              <w:insideH w:val="single" w:sz="6" w:space="0" w:color="D9D9D9"/>
+              <w:insideV w:val="single" w:sz="6" w:space="0" w:color="D9D9D9"/>
+            </w:tcBorders>
+            <w:tcMar>
+              <w:top w:w="100" w:type="dxa"/>
+              <w:start w:w="120" w:type="dxa"/>
+              <w:bottom w:w="100" w:type="dxa"/>
+              <w:end w:w="120" w:type="dxa"/>
+            </w:tcMar>
+            <w:vAlign w:val="center"/>
+          </w:tcPr>
+          <w:p>
+            <w:pPr>
+              <w:spacing w:after="0" w:line="252" w:lineRule="auto"/>
+              <w:jc w:val="center"/>
+            </w:pPr>
+            <w:r>
+              <w:rPr>
+                <w:sz w:val="18"/>
+              </w:rPr>
+              <w:t>Carga inicial</w:t>
+            </w:r>
+          </w:p>
+        </w:tc>
+        <w:tc>
+          <w:tcPr>
+            <w:tcW w:type="dxa" w:w="3293"/>
+            <w:tcBorders>
+              <w:top w:val="single" w:sz="6" w:space="0" w:color="D9D9D9"/>
+              <w:left w:val="single" w:sz="6" w:space="0" w:color="D9D9D9"/>
+              <w:bottom w:val="single" w:sz="6" w:space="0" w:color="D9D9D9"/>
+              <w:right w:val="single" w:sz="6" w:space="0" w:color="D9D9D9"/>
+              <w:insideH w:val="single" w:sz="6" w:space="0" w:color="D9D9D9"/>
+              <w:insideV w:val="single" w:sz="6" w:space="0" w:color="D9D9D9"/>
+            </w:tcBorders>
+            <w:tcMar>
+              <w:top w:w="100" w:type="dxa"/>
+              <w:start w:w="120" w:type="dxa"/>
+              <w:bottom w:w="100" w:type="dxa"/>
+              <w:end w:w="120" w:type="dxa"/>
+            </w:tcMar>
+            <w:vAlign w:val="center"/>
+          </w:tcPr>
+          <w:p>
+            <w:pPr>
+              <w:spacing w:after="0" w:line="252" w:lineRule="auto"/>
+            </w:pPr>
+            <w:r>
+              <w:rPr>
+                <w:sz w:val="18"/>
+              </w:rPr>
+              <w:t>Mensaje de carga mientras se obtienen los datos base del tablero.</w:t>
+            </w:r>
+          </w:p>
+        </w:tc>
+        <w:tc>
+          <w:tcPr>
+            <w:tcW w:type="dxa" w:w="3293"/>
+            <w:tcBorders>
+              <w:top w:val="single" w:sz="6" w:space="0" w:color="D9D9D9"/>
+              <w:left w:val="single" w:sz="6" w:space="0" w:color="D9D9D9"/>
+              <w:bottom w:val="single" w:sz="6" w:space="0" w:color="D9D9D9"/>
+              <w:right w:val="single" w:sz="6" w:space="0" w:color="D9D9D9"/>
+              <w:insideH w:val="single" w:sz="6" w:space="0" w:color="D9D9D9"/>
+              <w:insideV w:val="single" w:sz="6" w:space="0" w:color="D9D9D9"/>
+            </w:tcBorders>
+            <w:tcMar>
+              <w:top w:w="100" w:type="dxa"/>
+              <w:start w:w="120" w:type="dxa"/>
+              <w:bottom w:w="100" w:type="dxa"/>
+              <w:end w:w="120" w:type="dxa"/>
+            </w:tcMar>
+            <w:vAlign w:val="center"/>
+          </w:tcPr>
+          <w:p>
+            <w:pPr>
+              <w:spacing w:after="0" w:line="252" w:lineRule="auto"/>
+            </w:pPr>
+            <w:r>
+              <w:rPr>
+                <w:sz w:val="18"/>
+              </w:rPr>
+              <w:t>Evitar que el usuario vea una pantalla incompleta durante la conexión inicial.</w:t>
+            </w:r>
+          </w:p>
+        </w:tc>
+      </w:tr>
+      <w:tr>
+        <w:trPr>
+          <w:cantSplit/>
+        </w:trPr>
+        <w:tc>
+          <w:tcPr>
+            <w:tcW w:type="dxa" w:w="3293"/>
+            <w:tcBorders>
+              <w:top w:val="single" w:sz="6" w:space="0" w:color="D9D9D9"/>
+              <w:left w:val="single" w:sz="6" w:space="0" w:color="D9D9D9"/>
+              <w:bottom w:val="single" w:sz="6" w:space="0" w:color="D9D9D9"/>
+              <w:right w:val="single" w:sz="6" w:space="0" w:color="D9D9D9"/>
+              <w:insideH w:val="single" w:sz="6" w:space="0" w:color="D9D9D9"/>
+              <w:insideV w:val="single" w:sz="6" w:space="0" w:color="D9D9D9"/>
+            </w:tcBorders>
+            <w:tcMar>
+              <w:top w:w="100" w:type="dxa"/>
+              <w:start w:w="120" w:type="dxa"/>
+              <w:bottom w:w="100" w:type="dxa"/>
+              <w:end w:w="120" w:type="dxa"/>
+            </w:tcMar>
+            <w:shd w:fill="F8FAFC"/>
+            <w:vAlign w:val="center"/>
+          </w:tcPr>
+          <w:p>
+            <w:pPr>
+              <w:spacing w:after="0" w:line="252" w:lineRule="auto"/>
+              <w:jc w:val="center"/>
+            </w:pPr>
+            <w:r>
+              <w:rPr>
+                <w:sz w:val="18"/>
+              </w:rPr>
+              <w:t>Error de carga</w:t>
+            </w:r>
+          </w:p>
+        </w:tc>
+        <w:tc>
+          <w:tcPr>
+            <w:tcW w:type="dxa" w:w="3293"/>
+            <w:tcBorders>
+              <w:top w:val="single" w:sz="6" w:space="0" w:color="D9D9D9"/>
+              <w:left w:val="single" w:sz="6" w:space="0" w:color="D9D9D9"/>
+              <w:bottom w:val="single" w:sz="6" w:space="0" w:color="D9D9D9"/>
+              <w:right w:val="single" w:sz="6" w:space="0" w:color="D9D9D9"/>
+              <w:insideH w:val="single" w:sz="6" w:space="0" w:color="D9D9D9"/>
+              <w:insideV w:val="single" w:sz="6" w:space="0" w:color="D9D9D9"/>
+            </w:tcBorders>
+            <w:tcMar>
+              <w:top w:w="100" w:type="dxa"/>
+              <w:start w:w="120" w:type="dxa"/>
+              <w:bottom w:w="100" w:type="dxa"/>
+              <w:end w:w="120" w:type="dxa"/>
+            </w:tcMar>
+            <w:shd w:fill="F8FAFC"/>
+            <w:vAlign w:val="center"/>
+          </w:tcPr>
+          <w:p>
+            <w:pPr>
+              <w:spacing w:after="0" w:line="252" w:lineRule="auto"/>
+            </w:pPr>
+            <w:r>
+              <w:rPr>
+                <w:sz w:val="18"/>
+              </w:rPr>
+              <w:t>Mensaje de error con botón Reintentar.</w:t>
+            </w:r>
+          </w:p>
+        </w:tc>
+        <w:tc>
+          <w:tcPr>
+            <w:tcW w:type="dxa" w:w="3293"/>
+            <w:tcBorders>
+              <w:top w:val="single" w:sz="6" w:space="0" w:color="D9D9D9"/>
+              <w:left w:val="single" w:sz="6" w:space="0" w:color="D9D9D9"/>
+              <w:bottom w:val="single" w:sz="6" w:space="0" w:color="D9D9D9"/>
+              <w:right w:val="single" w:sz="6" w:space="0" w:color="D9D9D9"/>
+              <w:insideH w:val="single" w:sz="6" w:space="0" w:color="D9D9D9"/>
+              <w:insideV w:val="single" w:sz="6" w:space="0" w:color="D9D9D9"/>
+            </w:tcBorders>
+            <w:tcMar>
+              <w:top w:w="100" w:type="dxa"/>
+              <w:start w:w="120" w:type="dxa"/>
+              <w:bottom w:w="100" w:type="dxa"/>
+              <w:end w:w="120" w:type="dxa"/>
+            </w:tcMar>
+            <w:shd w:fill="F8FAFC"/>
+            <w:vAlign w:val="center"/>
+          </w:tcPr>
+          <w:p>
+            <w:pPr>
+              <w:spacing w:after="0" w:line="252" w:lineRule="auto"/>
+            </w:pPr>
+            <w:r>
+              <w:rPr>
+                <w:sz w:val="18"/>
+              </w:rPr>
+              <w:t>Permitir recuperar la pantalla si el backend no estaba disponible o falló temporalmente.</w:t>
+            </w:r>
+          </w:p>
+        </w:tc>
+      </w:tr>
+      <w:tr>
+        <w:trPr>
+          <w:cantSplit/>
+        </w:trPr>
+        <w:tc>
+          <w:tcPr>
+            <w:tcW w:type="dxa" w:w="3293"/>
+            <w:tcBorders>
+              <w:top w:val="single" w:sz="6" w:space="0" w:color="D9D9D9"/>
+              <w:left w:val="single" w:sz="6" w:space="0" w:color="D9D9D9"/>
+              <w:bottom w:val="single" w:sz="6" w:space="0" w:color="D9D9D9"/>
+              <w:right w:val="single" w:sz="6" w:space="0" w:color="D9D9D9"/>
+              <w:insideH w:val="single" w:sz="6" w:space="0" w:color="D9D9D9"/>
+              <w:insideV w:val="single" w:sz="6" w:space="0" w:color="D9D9D9"/>
+            </w:tcBorders>
+            <w:tcMar>
+              <w:top w:w="100" w:type="dxa"/>
+              <w:start w:w="120" w:type="dxa"/>
+              <w:bottom w:w="100" w:type="dxa"/>
+              <w:end w:w="120" w:type="dxa"/>
+            </w:tcMar>
+            <w:vAlign w:val="center"/>
+          </w:tcPr>
+          <w:p>
+            <w:pPr>
+              <w:spacing w:after="0" w:line="252" w:lineRule="auto"/>
+              <w:jc w:val="center"/>
+            </w:pPr>
+            <w:r>
+              <w:rPr>
+                <w:sz w:val="18"/>
+              </w:rPr>
+              <w:t>Predicción pendiente</w:t>
+            </w:r>
+          </w:p>
+        </w:tc>
+        <w:tc>
+          <w:tcPr>
+            <w:tcW w:type="dxa" w:w="3293"/>
+            <w:tcBorders>
+              <w:top w:val="single" w:sz="6" w:space="0" w:color="D9D9D9"/>
+              <w:left w:val="single" w:sz="6" w:space="0" w:color="D9D9D9"/>
+              <w:bottom w:val="single" w:sz="6" w:space="0" w:color="D9D9D9"/>
+              <w:right w:val="single" w:sz="6" w:space="0" w:color="D9D9D9"/>
+              <w:insideH w:val="single" w:sz="6" w:space="0" w:color="D9D9D9"/>
+              <w:insideV w:val="single" w:sz="6" w:space="0" w:color="D9D9D9"/>
+            </w:tcBorders>
+            <w:tcMar>
+              <w:top w:w="100" w:type="dxa"/>
+              <w:start w:w="120" w:type="dxa"/>
+              <w:bottom w:w="100" w:type="dxa"/>
+              <w:end w:w="120" w:type="dxa"/>
+            </w:tcMar>
+            <w:vAlign w:val="center"/>
+          </w:tcPr>
+          <w:p>
+            <w:pPr>
+              <w:spacing w:after="0" w:line="252" w:lineRule="auto"/>
+            </w:pPr>
+            <w:r>
+              <w:rPr>
+                <w:sz w:val="18"/>
+              </w:rPr>
+              <w:t>Panel de resultado con etiqueta Pendiente y mensaje Sin predicción ejecutada.</w:t>
+            </w:r>
+          </w:p>
+        </w:tc>
+        <w:tc>
+          <w:tcPr>
+            <w:tcW w:type="dxa" w:w="3293"/>
+            <w:tcBorders>
+              <w:top w:val="single" w:sz="6" w:space="0" w:color="D9D9D9"/>
+              <w:left w:val="single" w:sz="6" w:space="0" w:color="D9D9D9"/>
+              <w:bottom w:val="single" w:sz="6" w:space="0" w:color="D9D9D9"/>
+              <w:right w:val="single" w:sz="6" w:space="0" w:color="D9D9D9"/>
+              <w:insideH w:val="single" w:sz="6" w:space="0" w:color="D9D9D9"/>
+              <w:insideV w:val="single" w:sz="6" w:space="0" w:color="D9D9D9"/>
+            </w:tcBorders>
+            <w:tcMar>
+              <w:top w:w="100" w:type="dxa"/>
+              <w:start w:w="120" w:type="dxa"/>
+              <w:bottom w:w="100" w:type="dxa"/>
+              <w:end w:w="120" w:type="dxa"/>
+            </w:tcMar>
+            <w:vAlign w:val="center"/>
+          </w:tcPr>
+          <w:p>
+            <w:pPr>
+              <w:spacing w:after="0" w:line="252" w:lineRule="auto"/>
+            </w:pPr>
+            <w:r>
+              <w:rPr>
+                <w:sz w:val="18"/>
+              </w:rPr>
+              <w:t>Diferenciar claramente el estado inicial de una predicción real.</w:t>
+            </w:r>
+          </w:p>
+        </w:tc>
+      </w:tr>
+      <w:tr>
+        <w:trPr>
+          <w:cantSplit/>
+        </w:trPr>
+        <w:tc>
+          <w:tcPr>
+            <w:tcW w:type="dxa" w:w="3293"/>
+            <w:tcBorders>
+              <w:top w:val="single" w:sz="6" w:space="0" w:color="D9D9D9"/>
+              <w:left w:val="single" w:sz="6" w:space="0" w:color="D9D9D9"/>
+              <w:bottom w:val="single" w:sz="6" w:space="0" w:color="D9D9D9"/>
+              <w:right w:val="single" w:sz="6" w:space="0" w:color="D9D9D9"/>
+              <w:insideH w:val="single" w:sz="6" w:space="0" w:color="D9D9D9"/>
+              <w:insideV w:val="single" w:sz="6" w:space="0" w:color="D9D9D9"/>
+            </w:tcBorders>
+            <w:tcMar>
+              <w:top w:w="100" w:type="dxa"/>
+              <w:start w:w="120" w:type="dxa"/>
+              <w:bottom w:w="100" w:type="dxa"/>
+              <w:end w:w="120" w:type="dxa"/>
+            </w:tcMar>
+            <w:shd w:fill="F8FAFC"/>
+            <w:vAlign w:val="center"/>
+          </w:tcPr>
+          <w:p>
+            <w:pPr>
+              <w:spacing w:after="0" w:line="252" w:lineRule="auto"/>
+              <w:jc w:val="center"/>
+            </w:pPr>
+            <w:r>
+              <w:rPr>
+                <w:sz w:val="18"/>
+              </w:rPr>
+              <w:t>Servicio consultando</w:t>
+            </w:r>
+          </w:p>
+        </w:tc>
+        <w:tc>
+          <w:tcPr>
+            <w:tcW w:type="dxa" w:w="3293"/>
+            <w:tcBorders>
+              <w:top w:val="single" w:sz="6" w:space="0" w:color="D9D9D9"/>
+              <w:left w:val="single" w:sz="6" w:space="0" w:color="D9D9D9"/>
+              <w:bottom w:val="single" w:sz="6" w:space="0" w:color="D9D9D9"/>
+              <w:right w:val="single" w:sz="6" w:space="0" w:color="D9D9D9"/>
+              <w:insideH w:val="single" w:sz="6" w:space="0" w:color="D9D9D9"/>
+              <w:insideV w:val="single" w:sz="6" w:space="0" w:color="D9D9D9"/>
+            </w:tcBorders>
+            <w:tcMar>
+              <w:top w:w="100" w:type="dxa"/>
+              <w:start w:w="120" w:type="dxa"/>
+              <w:bottom w:w="100" w:type="dxa"/>
+              <w:end w:w="120" w:type="dxa"/>
+            </w:tcMar>
+            <w:shd w:fill="F8FAFC"/>
+            <w:vAlign w:val="center"/>
+          </w:tcPr>
+          <w:p>
+            <w:pPr>
+              <w:spacing w:after="0" w:line="252" w:lineRule="auto"/>
+            </w:pPr>
+            <w:r>
+              <w:rPr>
+                <w:sz w:val="18"/>
+              </w:rPr>
+              <w:t>Botones deshabilitados y mensaje Consultando servicio.</w:t>
+            </w:r>
+          </w:p>
+        </w:tc>
+        <w:tc>
+          <w:tcPr>
+            <w:tcW w:type="dxa" w:w="3293"/>
+            <w:tcBorders>
+              <w:top w:val="single" w:sz="6" w:space="0" w:color="D9D9D9"/>
+              <w:left w:val="single" w:sz="6" w:space="0" w:color="D9D9D9"/>
+              <w:bottom w:val="single" w:sz="6" w:space="0" w:color="D9D9D9"/>
+              <w:right w:val="single" w:sz="6" w:space="0" w:color="D9D9D9"/>
+              <w:insideH w:val="single" w:sz="6" w:space="0" w:color="D9D9D9"/>
+              <w:insideV w:val="single" w:sz="6" w:space="0" w:color="D9D9D9"/>
+            </w:tcBorders>
+            <w:tcMar>
+              <w:top w:w="100" w:type="dxa"/>
+              <w:start w:w="120" w:type="dxa"/>
+              <w:bottom w:w="100" w:type="dxa"/>
+              <w:end w:w="120" w:type="dxa"/>
+            </w:tcMar>
+            <w:shd w:fill="F8FAFC"/>
+            <w:vAlign w:val="center"/>
+          </w:tcPr>
+          <w:p>
+            <w:pPr>
+              <w:spacing w:after="0" w:line="252" w:lineRule="auto"/>
+            </w:pPr>
+            <w:r>
+              <w:rPr>
+                <w:sz w:val="18"/>
+              </w:rPr>
+              <w:t>Indicar que la operación está en proceso y evitar envíos duplicados.</w:t>
+            </w:r>
+          </w:p>
+        </w:tc>
+      </w:tr>
+      <w:tr>
+        <w:trPr>
+          <w:cantSplit/>
+        </w:trPr>
+        <w:tc>
+          <w:tcPr>
+            <w:tcW w:type="dxa" w:w="3293"/>
+            <w:tcBorders>
+              <w:top w:val="single" w:sz="6" w:space="0" w:color="D9D9D9"/>
+              <w:left w:val="single" w:sz="6" w:space="0" w:color="D9D9D9"/>
+              <w:bottom w:val="single" w:sz="6" w:space="0" w:color="D9D9D9"/>
+              <w:right w:val="single" w:sz="6" w:space="0" w:color="D9D9D9"/>
+              <w:insideH w:val="single" w:sz="6" w:space="0" w:color="D9D9D9"/>
+              <w:insideV w:val="single" w:sz="6" w:space="0" w:color="D9D9D9"/>
+            </w:tcBorders>
+            <w:tcMar>
+              <w:top w:w="100" w:type="dxa"/>
+              <w:start w:w="120" w:type="dxa"/>
+              <w:bottom w:w="100" w:type="dxa"/>
+              <w:end w:w="120" w:type="dxa"/>
+            </w:tcMar>
+            <w:vAlign w:val="center"/>
+          </w:tcPr>
+          <w:p>
+            <w:pPr>
+              <w:spacing w:after="0" w:line="252" w:lineRule="auto"/>
+              <w:jc w:val="center"/>
+            </w:pPr>
+            <w:r>
+              <w:rPr>
+                <w:sz w:val="18"/>
+              </w:rPr>
+              <w:t>Respuesta inválida</w:t>
+            </w:r>
+          </w:p>
+        </w:tc>
+        <w:tc>
+          <w:tcPr>
+            <w:tcW w:type="dxa" w:w="3293"/>
+            <w:tcBorders>
+              <w:top w:val="single" w:sz="6" w:space="0" w:color="D9D9D9"/>
+              <w:left w:val="single" w:sz="6" w:space="0" w:color="D9D9D9"/>
+              <w:bottom w:val="single" w:sz="6" w:space="0" w:color="D9D9D9"/>
+              <w:right w:val="single" w:sz="6" w:space="0" w:color="D9D9D9"/>
+              <w:insideH w:val="single" w:sz="6" w:space="0" w:color="D9D9D9"/>
+              <w:insideV w:val="single" w:sz="6" w:space="0" w:color="D9D9D9"/>
+            </w:tcBorders>
+            <w:tcMar>
+              <w:top w:w="100" w:type="dxa"/>
+              <w:start w:w="120" w:type="dxa"/>
+              <w:bottom w:w="100" w:type="dxa"/>
+              <w:end w:w="120" w:type="dxa"/>
+            </w:tcMar>
+            <w:vAlign w:val="center"/>
+          </w:tcPr>
+          <w:p>
+            <w:pPr>
+              <w:spacing w:after="0" w:line="252" w:lineRule="auto"/>
+            </w:pPr>
+            <w:r>
+              <w:rPr>
+                <w:sz w:val="18"/>
+              </w:rPr>
+              <w:t>Mensaje de error cuando faltan id, clase o probabilidades válidas.</w:t>
+            </w:r>
+          </w:p>
+        </w:tc>
+        <w:tc>
+          <w:tcPr>
+            <w:tcW w:type="dxa" w:w="3293"/>
+            <w:tcBorders>
+              <w:top w:val="single" w:sz="6" w:space="0" w:color="D9D9D9"/>
+              <w:left w:val="single" w:sz="6" w:space="0" w:color="D9D9D9"/>
+              <w:bottom w:val="single" w:sz="6" w:space="0" w:color="D9D9D9"/>
+              <w:right w:val="single" w:sz="6" w:space="0" w:color="D9D9D9"/>
+              <w:insideH w:val="single" w:sz="6" w:space="0" w:color="D9D9D9"/>
+              <w:insideV w:val="single" w:sz="6" w:space="0" w:color="D9D9D9"/>
+            </w:tcBorders>
+            <w:tcMar>
+              <w:top w:w="100" w:type="dxa"/>
+              <w:start w:w="120" w:type="dxa"/>
+              <w:bottom w:w="100" w:type="dxa"/>
+              <w:end w:w="120" w:type="dxa"/>
+            </w:tcMar>
+            <w:vAlign w:val="center"/>
+          </w:tcPr>
+          <w:p>
+            <w:pPr>
+              <w:spacing w:after="0" w:line="252" w:lineRule="auto"/>
+            </w:pPr>
+            <w:r>
+              <w:rPr>
+                <w:sz w:val="18"/>
+              </w:rPr>
+              <w:t>Impedir que el tablero represente datos incompletos como resultado del modelo.</w:t>
+            </w:r>
+          </w:p>
+        </w:tc>
+      </w:tr>
+      <w:tr>
+        <w:trPr>
+          <w:cantSplit/>
+        </w:trPr>
+        <w:tc>
+          <w:tcPr>
+            <w:tcW w:type="dxa" w:w="3293"/>
+            <w:tcBorders>
+              <w:top w:val="single" w:sz="6" w:space="0" w:color="D9D9D9"/>
+              <w:left w:val="single" w:sz="6" w:space="0" w:color="D9D9D9"/>
+              <w:bottom w:val="single" w:sz="6" w:space="0" w:color="D9D9D9"/>
+              <w:right w:val="single" w:sz="6" w:space="0" w:color="D9D9D9"/>
+              <w:insideH w:val="single" w:sz="6" w:space="0" w:color="D9D9D9"/>
+              <w:insideV w:val="single" w:sz="6" w:space="0" w:color="D9D9D9"/>
+            </w:tcBorders>
+            <w:tcMar>
+              <w:top w:w="100" w:type="dxa"/>
+              <w:start w:w="120" w:type="dxa"/>
+              <w:bottom w:w="100" w:type="dxa"/>
+              <w:end w:w="120" w:type="dxa"/>
+            </w:tcMar>
+            <w:shd w:fill="F8FAFC"/>
+            <w:vAlign w:val="center"/>
+          </w:tcPr>
+          <w:p>
+            <w:pPr>
+              <w:spacing w:after="0" w:line="252" w:lineRule="auto"/>
+              <w:jc w:val="center"/>
+            </w:pPr>
+            <w:r>
+              <w:rPr>
+                <w:sz w:val="18"/>
+              </w:rPr>
+              <w:t>Baja confianza</w:t>
+            </w:r>
+          </w:p>
+        </w:tc>
+        <w:tc>
+          <w:tcPr>
+            <w:tcW w:type="dxa" w:w="3293"/>
+            <w:tcBorders>
+              <w:top w:val="single" w:sz="6" w:space="0" w:color="D9D9D9"/>
+              <w:left w:val="single" w:sz="6" w:space="0" w:color="D9D9D9"/>
+              <w:bottom w:val="single" w:sz="6" w:space="0" w:color="D9D9D9"/>
+              <w:right w:val="single" w:sz="6" w:space="0" w:color="D9D9D9"/>
+              <w:insideH w:val="single" w:sz="6" w:space="0" w:color="D9D9D9"/>
+              <w:insideV w:val="single" w:sz="6" w:space="0" w:color="D9D9D9"/>
+            </w:tcBorders>
+            <w:tcMar>
+              <w:top w:w="100" w:type="dxa"/>
+              <w:start w:w="120" w:type="dxa"/>
+              <w:bottom w:w="100" w:type="dxa"/>
+              <w:end w:w="120" w:type="dxa"/>
+            </w:tcMar>
+            <w:shd w:fill="F8FAFC"/>
+            <w:vAlign w:val="center"/>
+          </w:tcPr>
+          <w:p>
+            <w:pPr>
+              <w:spacing w:after="0" w:line="252" w:lineRule="auto"/>
+            </w:pPr>
+            <w:r>
+              <w:rPr>
+                <w:sz w:val="18"/>
+              </w:rPr>
+              <w:t>Aviso destacado cuando la probabilidad más alta es menor al umbral del tablero.</w:t>
+            </w:r>
+          </w:p>
+        </w:tc>
+        <w:tc>
+          <w:tcPr>
+            <w:tcW w:type="dxa" w:w="3293"/>
+            <w:tcBorders>
+              <w:top w:val="single" w:sz="6" w:space="0" w:color="D9D9D9"/>
+              <w:left w:val="single" w:sz="6" w:space="0" w:color="D9D9D9"/>
+              <w:bottom w:val="single" w:sz="6" w:space="0" w:color="D9D9D9"/>
+              <w:right w:val="single" w:sz="6" w:space="0" w:color="D9D9D9"/>
+              <w:insideH w:val="single" w:sz="6" w:space="0" w:color="D9D9D9"/>
+              <w:insideV w:val="single" w:sz="6" w:space="0" w:color="D9D9D9"/>
+            </w:tcBorders>
+            <w:tcMar>
+              <w:top w:w="100" w:type="dxa"/>
+              <w:start w:w="120" w:type="dxa"/>
+              <w:bottom w:w="100" w:type="dxa"/>
+              <w:end w:w="120" w:type="dxa"/>
+            </w:tcMar>
+            <w:shd w:fill="F8FAFC"/>
+            <w:vAlign w:val="center"/>
+          </w:tcPr>
+          <w:p>
+            <w:pPr>
+              <w:spacing w:after="0" w:line="252" w:lineRule="auto"/>
+            </w:pPr>
+            <w:r>
+              <w:rPr>
+                <w:sz w:val="18"/>
+              </w:rPr>
+              <w:t>Ayudar al usuario a interpretar el resultado con cautela.</w:t>
+            </w:r>
+          </w:p>
+        </w:tc>
+      </w:tr>
+      <w:tr>
+        <w:trPr>
+          <w:cantSplit/>
+        </w:trPr>
+        <w:tc>
+          <w:tcPr>
+            <w:tcW w:type="dxa" w:w="3293"/>
+            <w:tcBorders>
+              <w:top w:val="single" w:sz="6" w:space="0" w:color="D9D9D9"/>
+              <w:left w:val="single" w:sz="6" w:space="0" w:color="D9D9D9"/>
+              <w:bottom w:val="single" w:sz="6" w:space="0" w:color="D9D9D9"/>
+              <w:right w:val="single" w:sz="6" w:space="0" w:color="D9D9D9"/>
+              <w:insideH w:val="single" w:sz="6" w:space="0" w:color="D9D9D9"/>
+              <w:insideV w:val="single" w:sz="6" w:space="0" w:color="D9D9D9"/>
+            </w:tcBorders>
+            <w:tcMar>
+              <w:top w:w="100" w:type="dxa"/>
+              <w:start w:w="120" w:type="dxa"/>
+              <w:bottom w:w="100" w:type="dxa"/>
+              <w:end w:w="120" w:type="dxa"/>
+            </w:tcMar>
+            <w:vAlign w:val="center"/>
+          </w:tcPr>
+          <w:p>
+            <w:pPr>
+              <w:spacing w:after="0" w:line="252" w:lineRule="auto"/>
+              <w:jc w:val="center"/>
+            </w:pPr>
+            <w:r>
+              <w:rPr>
+                <w:sz w:val="18"/>
+              </w:rPr>
+              <w:t>Datos vacíos</w:t>
+            </w:r>
+          </w:p>
+        </w:tc>
+        <w:tc>
+          <w:tcPr>
+            <w:tcW w:type="dxa" w:w="3293"/>
+            <w:tcBorders>
+              <w:top w:val="single" w:sz="6" w:space="0" w:color="D9D9D9"/>
+              <w:left w:val="single" w:sz="6" w:space="0" w:color="D9D9D9"/>
+              <w:bottom w:val="single" w:sz="6" w:space="0" w:color="D9D9D9"/>
+              <w:right w:val="single" w:sz="6" w:space="0" w:color="D9D9D9"/>
+              <w:insideH w:val="single" w:sz="6" w:space="0" w:color="D9D9D9"/>
+              <w:insideV w:val="single" w:sz="6" w:space="0" w:color="D9D9D9"/>
+            </w:tcBorders>
+            <w:tcMar>
+              <w:top w:w="100" w:type="dxa"/>
+              <w:start w:w="120" w:type="dxa"/>
+              <w:bottom w:w="100" w:type="dxa"/>
+              <w:end w:w="120" w:type="dxa"/>
+            </w:tcMar>
+            <w:vAlign w:val="center"/>
+          </w:tcPr>
+          <w:p>
+            <w:pPr>
+              <w:spacing w:after="0" w:line="252" w:lineRule="auto"/>
+            </w:pPr>
+            <w:r>
+              <w:rPr>
+                <w:sz w:val="18"/>
+              </w:rPr>
+              <w:t>Mensajes informativos en historial o variables explicativas cuando no hay registros.</w:t>
+            </w:r>
+          </w:p>
+        </w:tc>
+        <w:tc>
+          <w:tcPr>
+            <w:tcW w:type="dxa" w:w="3293"/>
+            <w:tcBorders>
+              <w:top w:val="single" w:sz="6" w:space="0" w:color="D9D9D9"/>
+              <w:left w:val="single" w:sz="6" w:space="0" w:color="D9D9D9"/>
+              <w:bottom w:val="single" w:sz="6" w:space="0" w:color="D9D9D9"/>
+              <w:right w:val="single" w:sz="6" w:space="0" w:color="D9D9D9"/>
+              <w:insideH w:val="single" w:sz="6" w:space="0" w:color="D9D9D9"/>
+              <w:insideV w:val="single" w:sz="6" w:space="0" w:color="D9D9D9"/>
+            </w:tcBorders>
+            <w:tcMar>
+              <w:top w:w="100" w:type="dxa"/>
+              <w:start w:w="120" w:type="dxa"/>
+              <w:bottom w:w="100" w:type="dxa"/>
+              <w:end w:w="120" w:type="dxa"/>
+            </w:tcMar>
+            <w:vAlign w:val="center"/>
+          </w:tcPr>
+          <w:p>
+            <w:pPr>
+              <w:spacing w:after="0" w:line="252" w:lineRule="auto"/>
+            </w:pPr>
+            <w:r>
+              <w:rPr>
+                <w:sz w:val="18"/>
+              </w:rPr>
+              <w:t>Mantener la interfaz legible aunque algunos conjuntos de datos aún no estén disponibles.</w:t>
+            </w:r>
+          </w:p>
+        </w:tc>
+      </w:tr>
+    </w:tbl>
+    <w:p/>
     <w:p>
       <w:pPr>
         <w:pStyle w:val="Heading1"/>
@@ -126,10 +997,10 @@
     </w:p>
     <w:p>
       <w:pPr>
-        <w:spacing w:after="120" w:line="259" w:lineRule="auto"/>
+        <w:spacing w:after="140" w:line="259" w:lineRule="auto"/>
       </w:pPr>
       <w:r>
-        <w:t>La salida del modelo se presenta de forma orientada al usuario. El dashboard destaca la clase dominante como resultado principal y muestra las probabilidades en barras para comparar las tres orientaciónes. Esta decisión evita que el usuario dependa de una etiqueta aislada y le permite interpretar el nivel de seguridad del modelo. El identificador de predicción también queda visible para facilitar trazabilidad técnica durante pruebas y demostraciones.</w:t>
+        <w:t>El resultado se presenta en dos niveles. Primero, el tablero destaca la clase dominante como la predicción principal. Segundo, muestra las probabilidades de las tres orientaciones para que el usuario pueda comparar la distribución de la salida. Esta representación evita depender únicamente de una etiqueta y permite identificar casos cercanos, especialmente cuando ninguna probabilidad domina con claridad.</w:t>
       </w:r>
     </w:p>
     <w:p>
@@ -137,45 +1008,511 @@
         <w:pStyle w:val="Heading1"/>
       </w:pPr>
       <w:r>
-        <w:t>Elementos de contexto</w:t>
+        <w:t>Vistas y elementos complementarios</w:t>
       </w:r>
     </w:p>
-    <w:p>
-      <w:pPr>
-        <w:pStyle w:val="ListBullet"/>
-        <w:spacing w:after="80" w:line="252" w:lineRule="auto"/>
-      </w:pPr>
-      <w:r>
-        <w:t>Historial reciente de análisis para mostrar que el producto puede organizar consultas anteriores.</w:t>
-      </w:r>
-    </w:p>
-    <w:p>
-      <w:pPr>
-        <w:pStyle w:val="ListBullet"/>
-        <w:spacing w:after="80" w:line="252" w:lineRule="auto"/>
-      </w:pPr>
-      <w:r>
-        <w:t>Variables explicativas asociadas a expresiones relevantes, útiles para justificar la predicción del modelo.</w:t>
-      </w:r>
-    </w:p>
-    <w:p>
-      <w:pPr>
-        <w:pStyle w:val="ListBullet"/>
-        <w:spacing w:after="80" w:line="252" w:lineRule="auto"/>
-      </w:pPr>
-      <w:r>
-        <w:t>Sección de exploración para consultar noticias por tema, fuente u orientación.</w:t>
-      </w:r>
-    </w:p>
-    <w:p>
-      <w:pPr>
-        <w:pStyle w:val="ListBullet"/>
-        <w:spacing w:after="80" w:line="252" w:lineRule="auto"/>
-      </w:pPr>
-      <w:r>
-        <w:t>Indicadores del prototipo, incluyendo endpoint usado, clase estimada y análisis registrados.</w:t>
-      </w:r>
-    </w:p>
+    <w:tbl>
+      <w:tblPr>
+        <w:tblStyle w:val="TableGrid"/>
+        <w:tblW w:type="auto" w:w="0"/>
+        <w:tblLayout w:type="autofit"/>
+        <w:tblLook w:firstColumn="1" w:firstRow="1" w:lastColumn="0" w:lastRow="0" w:noHBand="0" w:noVBand="1" w:val="04A0"/>
+      </w:tblPr>
+      <w:tblGrid>
+        <w:gridCol w:w="4939"/>
+        <w:gridCol w:w="4939"/>
+      </w:tblGrid>
+      <w:tr>
+        <w:trPr>
+          <w:cantSplit/>
+        </w:trPr>
+        <w:tc>
+          <w:tcPr>
+            <w:tcW w:type="dxa" w:w="2664"/>
+            <w:shd w:fill="E0F2FE"/>
+            <w:tcBorders>
+              <w:top w:val="single" w:sz="6" w:space="0" w:color="D9D9D9"/>
+              <w:left w:val="single" w:sz="6" w:space="0" w:color="D9D9D9"/>
+              <w:bottom w:val="single" w:sz="6" w:space="0" w:color="D9D9D9"/>
+              <w:right w:val="single" w:sz="6" w:space="0" w:color="D9D9D9"/>
+              <w:insideH w:val="single" w:sz="6" w:space="0" w:color="D9D9D9"/>
+              <w:insideV w:val="single" w:sz="6" w:space="0" w:color="D9D9D9"/>
+            </w:tcBorders>
+            <w:tcMar>
+              <w:top w:w="100" w:type="dxa"/>
+              <w:start w:w="120" w:type="dxa"/>
+              <w:bottom w:w="100" w:type="dxa"/>
+              <w:end w:w="120" w:type="dxa"/>
+            </w:tcMar>
+            <w:vAlign w:val="center"/>
+          </w:tcPr>
+          <w:p>
+            <w:pPr>
+              <w:spacing w:after="0"/>
+              <w:jc w:val="center"/>
+            </w:pPr>
+            <w:r>
+              <w:rPr>
+                <w:b/>
+                <w:color w:val="000000"/>
+                <w:sz w:val="19"/>
+              </w:rPr>
+              <w:t>Elemento</w:t>
+            </w:r>
+          </w:p>
+        </w:tc>
+        <w:tc>
+          <w:tcPr>
+            <w:tcW w:type="dxa" w:w="6552"/>
+            <w:shd w:fill="E0F2FE"/>
+            <w:tcBorders>
+              <w:top w:val="single" w:sz="6" w:space="0" w:color="D9D9D9"/>
+              <w:left w:val="single" w:sz="6" w:space="0" w:color="D9D9D9"/>
+              <w:bottom w:val="single" w:sz="6" w:space="0" w:color="D9D9D9"/>
+              <w:right w:val="single" w:sz="6" w:space="0" w:color="D9D9D9"/>
+              <w:insideH w:val="single" w:sz="6" w:space="0" w:color="D9D9D9"/>
+              <w:insideV w:val="single" w:sz="6" w:space="0" w:color="D9D9D9"/>
+            </w:tcBorders>
+            <w:tcMar>
+              <w:top w:w="100" w:type="dxa"/>
+              <w:start w:w="120" w:type="dxa"/>
+              <w:bottom w:w="100" w:type="dxa"/>
+              <w:end w:w="120" w:type="dxa"/>
+            </w:tcMar>
+            <w:vAlign w:val="center"/>
+          </w:tcPr>
+          <w:p>
+            <w:pPr>
+              <w:spacing w:after="0"/>
+              <w:jc w:val="center"/>
+            </w:pPr>
+            <w:r>
+              <w:rPr>
+                <w:b/>
+                <w:color w:val="000000"/>
+                <w:sz w:val="19"/>
+              </w:rPr>
+              <w:t>Función para el usuario</w:t>
+            </w:r>
+          </w:p>
+        </w:tc>
+      </w:tr>
+      <w:tr>
+        <w:trPr>
+          <w:cantSplit/>
+        </w:trPr>
+        <w:tc>
+          <w:tcPr>
+            <w:tcW w:type="dxa" w:w="4939"/>
+            <w:tcBorders>
+              <w:top w:val="single" w:sz="6" w:space="0" w:color="D9D9D9"/>
+              <w:left w:val="single" w:sz="6" w:space="0" w:color="D9D9D9"/>
+              <w:bottom w:val="single" w:sz="6" w:space="0" w:color="D9D9D9"/>
+              <w:right w:val="single" w:sz="6" w:space="0" w:color="D9D9D9"/>
+              <w:insideH w:val="single" w:sz="6" w:space="0" w:color="D9D9D9"/>
+              <w:insideV w:val="single" w:sz="6" w:space="0" w:color="D9D9D9"/>
+            </w:tcBorders>
+            <w:tcMar>
+              <w:top w:w="100" w:type="dxa"/>
+              <w:start w:w="120" w:type="dxa"/>
+              <w:bottom w:w="100" w:type="dxa"/>
+              <w:end w:w="120" w:type="dxa"/>
+            </w:tcMar>
+            <w:vAlign w:val="center"/>
+          </w:tcPr>
+          <w:p>
+            <w:pPr>
+              <w:spacing w:after="0" w:line="252" w:lineRule="auto"/>
+              <w:jc w:val="center"/>
+            </w:pPr>
+            <w:r>
+              <w:rPr>
+                <w:sz w:val="18"/>
+              </w:rPr>
+              <w:t>Explorar datos</w:t>
+            </w:r>
+          </w:p>
+        </w:tc>
+        <w:tc>
+          <w:tcPr>
+            <w:tcW w:type="dxa" w:w="4939"/>
+            <w:tcBorders>
+              <w:top w:val="single" w:sz="6" w:space="0" w:color="D9D9D9"/>
+              <w:left w:val="single" w:sz="6" w:space="0" w:color="D9D9D9"/>
+              <w:bottom w:val="single" w:sz="6" w:space="0" w:color="D9D9D9"/>
+              <w:right w:val="single" w:sz="6" w:space="0" w:color="D9D9D9"/>
+              <w:insideH w:val="single" w:sz="6" w:space="0" w:color="D9D9D9"/>
+              <w:insideV w:val="single" w:sz="6" w:space="0" w:color="D9D9D9"/>
+            </w:tcBorders>
+            <w:tcMar>
+              <w:top w:w="100" w:type="dxa"/>
+              <w:start w:w="120" w:type="dxa"/>
+              <w:bottom w:w="100" w:type="dxa"/>
+              <w:end w:w="120" w:type="dxa"/>
+            </w:tcMar>
+            <w:vAlign w:val="center"/>
+          </w:tcPr>
+          <w:p>
+            <w:pPr>
+              <w:spacing w:after="0" w:line="252" w:lineRule="auto"/>
+            </w:pPr>
+            <w:r>
+              <w:rPr>
+                <w:sz w:val="18"/>
+              </w:rPr>
+              <w:t>Permite consultar artículos por tema, fuente, orientación o fecha desde una vista separada.</w:t>
+            </w:r>
+          </w:p>
+        </w:tc>
+      </w:tr>
+      <w:tr>
+        <w:trPr>
+          <w:cantSplit/>
+        </w:trPr>
+        <w:tc>
+          <w:tcPr>
+            <w:tcW w:type="dxa" w:w="4939"/>
+            <w:tcBorders>
+              <w:top w:val="single" w:sz="6" w:space="0" w:color="D9D9D9"/>
+              <w:left w:val="single" w:sz="6" w:space="0" w:color="D9D9D9"/>
+              <w:bottom w:val="single" w:sz="6" w:space="0" w:color="D9D9D9"/>
+              <w:right w:val="single" w:sz="6" w:space="0" w:color="D9D9D9"/>
+              <w:insideH w:val="single" w:sz="6" w:space="0" w:color="D9D9D9"/>
+              <w:insideV w:val="single" w:sz="6" w:space="0" w:color="D9D9D9"/>
+            </w:tcBorders>
+            <w:tcMar>
+              <w:top w:w="100" w:type="dxa"/>
+              <w:start w:w="120" w:type="dxa"/>
+              <w:bottom w:w="100" w:type="dxa"/>
+              <w:end w:w="120" w:type="dxa"/>
+            </w:tcMar>
+            <w:shd w:fill="F8FAFC"/>
+            <w:vAlign w:val="center"/>
+          </w:tcPr>
+          <w:p>
+            <w:pPr>
+              <w:spacing w:after="0" w:line="252" w:lineRule="auto"/>
+              <w:jc w:val="center"/>
+            </w:pPr>
+            <w:r>
+              <w:rPr>
+                <w:sz w:val="18"/>
+              </w:rPr>
+              <w:t>Historial reciente</w:t>
+            </w:r>
+          </w:p>
+        </w:tc>
+        <w:tc>
+          <w:tcPr>
+            <w:tcW w:type="dxa" w:w="4939"/>
+            <w:tcBorders>
+              <w:top w:val="single" w:sz="6" w:space="0" w:color="D9D9D9"/>
+              <w:left w:val="single" w:sz="6" w:space="0" w:color="D9D9D9"/>
+              <w:bottom w:val="single" w:sz="6" w:space="0" w:color="D9D9D9"/>
+              <w:right w:val="single" w:sz="6" w:space="0" w:color="D9D9D9"/>
+              <w:insideH w:val="single" w:sz="6" w:space="0" w:color="D9D9D9"/>
+              <w:insideV w:val="single" w:sz="6" w:space="0" w:color="D9D9D9"/>
+            </w:tcBorders>
+            <w:tcMar>
+              <w:top w:w="100" w:type="dxa"/>
+              <w:start w:w="120" w:type="dxa"/>
+              <w:bottom w:w="100" w:type="dxa"/>
+              <w:end w:w="120" w:type="dxa"/>
+            </w:tcMar>
+            <w:shd w:fill="F8FAFC"/>
+            <w:vAlign w:val="center"/>
+          </w:tcPr>
+          <w:p>
+            <w:pPr>
+              <w:spacing w:after="0" w:line="252" w:lineRule="auto"/>
+            </w:pPr>
+            <w:r>
+              <w:rPr>
+                <w:sz w:val="18"/>
+              </w:rPr>
+              <w:t>Muestra análisis anteriores cuando existen registros disponibles.</w:t>
+            </w:r>
+          </w:p>
+        </w:tc>
+      </w:tr>
+      <w:tr>
+        <w:trPr>
+          <w:cantSplit/>
+        </w:trPr>
+        <w:tc>
+          <w:tcPr>
+            <w:tcW w:type="dxa" w:w="4939"/>
+            <w:tcBorders>
+              <w:top w:val="single" w:sz="6" w:space="0" w:color="D9D9D9"/>
+              <w:left w:val="single" w:sz="6" w:space="0" w:color="D9D9D9"/>
+              <w:bottom w:val="single" w:sz="6" w:space="0" w:color="D9D9D9"/>
+              <w:right w:val="single" w:sz="6" w:space="0" w:color="D9D9D9"/>
+              <w:insideH w:val="single" w:sz="6" w:space="0" w:color="D9D9D9"/>
+              <w:insideV w:val="single" w:sz="6" w:space="0" w:color="D9D9D9"/>
+            </w:tcBorders>
+            <w:tcMar>
+              <w:top w:w="100" w:type="dxa"/>
+              <w:start w:w="120" w:type="dxa"/>
+              <w:bottom w:w="100" w:type="dxa"/>
+              <w:end w:w="120" w:type="dxa"/>
+            </w:tcMar>
+            <w:vAlign w:val="center"/>
+          </w:tcPr>
+          <w:p>
+            <w:pPr>
+              <w:spacing w:after="0" w:line="252" w:lineRule="auto"/>
+              <w:jc w:val="center"/>
+            </w:pPr>
+            <w:r>
+              <w:rPr>
+                <w:sz w:val="18"/>
+              </w:rPr>
+              <w:t>Variables explicativas</w:t>
+            </w:r>
+          </w:p>
+        </w:tc>
+        <w:tc>
+          <w:tcPr>
+            <w:tcW w:type="dxa" w:w="4939"/>
+            <w:tcBorders>
+              <w:top w:val="single" w:sz="6" w:space="0" w:color="D9D9D9"/>
+              <w:left w:val="single" w:sz="6" w:space="0" w:color="D9D9D9"/>
+              <w:bottom w:val="single" w:sz="6" w:space="0" w:color="D9D9D9"/>
+              <w:right w:val="single" w:sz="6" w:space="0" w:color="D9D9D9"/>
+              <w:insideH w:val="single" w:sz="6" w:space="0" w:color="D9D9D9"/>
+              <w:insideV w:val="single" w:sz="6" w:space="0" w:color="D9D9D9"/>
+            </w:tcBorders>
+            <w:tcMar>
+              <w:top w:w="100" w:type="dxa"/>
+              <w:start w:w="120" w:type="dxa"/>
+              <w:bottom w:w="100" w:type="dxa"/>
+              <w:end w:w="120" w:type="dxa"/>
+            </w:tcMar>
+            <w:vAlign w:val="center"/>
+          </w:tcPr>
+          <w:p>
+            <w:pPr>
+              <w:spacing w:after="0" w:line="252" w:lineRule="auto"/>
+            </w:pPr>
+            <w:r>
+              <w:rPr>
+                <w:sz w:val="18"/>
+              </w:rPr>
+              <w:t>Presenta expresiones o rasgos que ayudan a contextualizar la predicción.</w:t>
+            </w:r>
+          </w:p>
+        </w:tc>
+      </w:tr>
+      <w:tr>
+        <w:trPr>
+          <w:cantSplit/>
+        </w:trPr>
+        <w:tc>
+          <w:tcPr>
+            <w:tcW w:type="dxa" w:w="4939"/>
+            <w:tcBorders>
+              <w:top w:val="single" w:sz="6" w:space="0" w:color="D9D9D9"/>
+              <w:left w:val="single" w:sz="6" w:space="0" w:color="D9D9D9"/>
+              <w:bottom w:val="single" w:sz="6" w:space="0" w:color="D9D9D9"/>
+              <w:right w:val="single" w:sz="6" w:space="0" w:color="D9D9D9"/>
+              <w:insideH w:val="single" w:sz="6" w:space="0" w:color="D9D9D9"/>
+              <w:insideV w:val="single" w:sz="6" w:space="0" w:color="D9D9D9"/>
+            </w:tcBorders>
+            <w:tcMar>
+              <w:top w:w="100" w:type="dxa"/>
+              <w:start w:w="120" w:type="dxa"/>
+              <w:bottom w:w="100" w:type="dxa"/>
+              <w:end w:w="120" w:type="dxa"/>
+            </w:tcMar>
+            <w:shd w:fill="F8FAFC"/>
+            <w:vAlign w:val="center"/>
+          </w:tcPr>
+          <w:p>
+            <w:pPr>
+              <w:spacing w:after="0" w:line="252" w:lineRule="auto"/>
+              <w:jc w:val="center"/>
+            </w:pPr>
+            <w:r>
+              <w:rPr>
+                <w:sz w:val="18"/>
+              </w:rPr>
+              <w:t>Favoritos</w:t>
+            </w:r>
+          </w:p>
+        </w:tc>
+        <w:tc>
+          <w:tcPr>
+            <w:tcW w:type="dxa" w:w="4939"/>
+            <w:tcBorders>
+              <w:top w:val="single" w:sz="6" w:space="0" w:color="D9D9D9"/>
+              <w:left w:val="single" w:sz="6" w:space="0" w:color="D9D9D9"/>
+              <w:bottom w:val="single" w:sz="6" w:space="0" w:color="D9D9D9"/>
+              <w:right w:val="single" w:sz="6" w:space="0" w:color="D9D9D9"/>
+              <w:insideH w:val="single" w:sz="6" w:space="0" w:color="D9D9D9"/>
+              <w:insideV w:val="single" w:sz="6" w:space="0" w:color="D9D9D9"/>
+            </w:tcBorders>
+            <w:tcMar>
+              <w:top w:w="100" w:type="dxa"/>
+              <w:start w:w="120" w:type="dxa"/>
+              <w:bottom w:w="100" w:type="dxa"/>
+              <w:end w:w="120" w:type="dxa"/>
+            </w:tcMar>
+            <w:shd w:fill="F8FAFC"/>
+            <w:vAlign w:val="center"/>
+          </w:tcPr>
+          <w:p>
+            <w:pPr>
+              <w:spacing w:after="0" w:line="252" w:lineRule="auto"/>
+            </w:pPr>
+            <w:r>
+              <w:rPr>
+                <w:sz w:val="18"/>
+              </w:rPr>
+              <w:t>Organiza artículos guardados por el usuario para consulta posterior.</w:t>
+            </w:r>
+          </w:p>
+        </w:tc>
+      </w:tr>
+      <w:tr>
+        <w:trPr>
+          <w:cantSplit/>
+        </w:trPr>
+        <w:tc>
+          <w:tcPr>
+            <w:tcW w:type="dxa" w:w="4939"/>
+            <w:tcBorders>
+              <w:top w:val="single" w:sz="6" w:space="0" w:color="D9D9D9"/>
+              <w:left w:val="single" w:sz="6" w:space="0" w:color="D9D9D9"/>
+              <w:bottom w:val="single" w:sz="6" w:space="0" w:color="D9D9D9"/>
+              <w:right w:val="single" w:sz="6" w:space="0" w:color="D9D9D9"/>
+              <w:insideH w:val="single" w:sz="6" w:space="0" w:color="D9D9D9"/>
+              <w:insideV w:val="single" w:sz="6" w:space="0" w:color="D9D9D9"/>
+            </w:tcBorders>
+            <w:tcMar>
+              <w:top w:w="100" w:type="dxa"/>
+              <w:start w:w="120" w:type="dxa"/>
+              <w:bottom w:w="100" w:type="dxa"/>
+              <w:end w:w="120" w:type="dxa"/>
+            </w:tcMar>
+            <w:vAlign w:val="center"/>
+          </w:tcPr>
+          <w:p>
+            <w:pPr>
+              <w:spacing w:after="0" w:line="252" w:lineRule="auto"/>
+              <w:jc w:val="center"/>
+            </w:pPr>
+            <w:r>
+              <w:rPr>
+                <w:sz w:val="18"/>
+              </w:rPr>
+              <w:t>Perfil</w:t>
+            </w:r>
+          </w:p>
+        </w:tc>
+        <w:tc>
+          <w:tcPr>
+            <w:tcW w:type="dxa" w:w="4939"/>
+            <w:tcBorders>
+              <w:top w:val="single" w:sz="6" w:space="0" w:color="D9D9D9"/>
+              <w:left w:val="single" w:sz="6" w:space="0" w:color="D9D9D9"/>
+              <w:bottom w:val="single" w:sz="6" w:space="0" w:color="D9D9D9"/>
+              <w:right w:val="single" w:sz="6" w:space="0" w:color="D9D9D9"/>
+              <w:insideH w:val="single" w:sz="6" w:space="0" w:color="D9D9D9"/>
+              <w:insideV w:val="single" w:sz="6" w:space="0" w:color="D9D9D9"/>
+            </w:tcBorders>
+            <w:tcMar>
+              <w:top w:w="100" w:type="dxa"/>
+              <w:start w:w="120" w:type="dxa"/>
+              <w:bottom w:w="100" w:type="dxa"/>
+              <w:end w:w="120" w:type="dxa"/>
+            </w:tcMar>
+            <w:vAlign w:val="center"/>
+          </w:tcPr>
+          <w:p>
+            <w:pPr>
+              <w:spacing w:after="0" w:line="252" w:lineRule="auto"/>
+            </w:pPr>
+            <w:r>
+              <w:rPr>
+                <w:sz w:val="18"/>
+              </w:rPr>
+              <w:t>Muestra información básica del usuario y estadísticas de uso.</w:t>
+            </w:r>
+          </w:p>
+        </w:tc>
+      </w:tr>
+      <w:tr>
+        <w:trPr>
+          <w:cantSplit/>
+        </w:trPr>
+        <w:tc>
+          <w:tcPr>
+            <w:tcW w:type="dxa" w:w="4939"/>
+            <w:tcBorders>
+              <w:top w:val="single" w:sz="6" w:space="0" w:color="D9D9D9"/>
+              <w:left w:val="single" w:sz="6" w:space="0" w:color="D9D9D9"/>
+              <w:bottom w:val="single" w:sz="6" w:space="0" w:color="D9D9D9"/>
+              <w:right w:val="single" w:sz="6" w:space="0" w:color="D9D9D9"/>
+              <w:insideH w:val="single" w:sz="6" w:space="0" w:color="D9D9D9"/>
+              <w:insideV w:val="single" w:sz="6" w:space="0" w:color="D9D9D9"/>
+            </w:tcBorders>
+            <w:tcMar>
+              <w:top w:w="100" w:type="dxa"/>
+              <w:start w:w="120" w:type="dxa"/>
+              <w:bottom w:w="100" w:type="dxa"/>
+              <w:end w:w="120" w:type="dxa"/>
+            </w:tcMar>
+            <w:shd w:fill="F8FAFC"/>
+            <w:vAlign w:val="center"/>
+          </w:tcPr>
+          <w:p>
+            <w:pPr>
+              <w:spacing w:after="0" w:line="252" w:lineRule="auto"/>
+              <w:jc w:val="center"/>
+            </w:pPr>
+            <w:r>
+              <w:rPr>
+                <w:sz w:val="18"/>
+              </w:rPr>
+              <w:t>Flujo por URL</w:t>
+            </w:r>
+          </w:p>
+        </w:tc>
+        <w:tc>
+          <w:tcPr>
+            <w:tcW w:type="dxa" w:w="4939"/>
+            <w:tcBorders>
+              <w:top w:val="single" w:sz="6" w:space="0" w:color="D9D9D9"/>
+              <w:left w:val="single" w:sz="6" w:space="0" w:color="D9D9D9"/>
+              <w:bottom w:val="single" w:sz="6" w:space="0" w:color="D9D9D9"/>
+              <w:right w:val="single" w:sz="6" w:space="0" w:color="D9D9D9"/>
+              <w:insideH w:val="single" w:sz="6" w:space="0" w:color="D9D9D9"/>
+              <w:insideV w:val="single" w:sz="6" w:space="0" w:color="D9D9D9"/>
+            </w:tcBorders>
+            <w:tcMar>
+              <w:top w:w="100" w:type="dxa"/>
+              <w:start w:w="120" w:type="dxa"/>
+              <w:bottom w:w="100" w:type="dxa"/>
+              <w:end w:w="120" w:type="dxa"/>
+            </w:tcMar>
+            <w:shd w:fill="F8FAFC"/>
+            <w:vAlign w:val="center"/>
+          </w:tcPr>
+          <w:p>
+            <w:pPr>
+              <w:spacing w:after="0" w:line="252" w:lineRule="auto"/>
+            </w:pPr>
+            <w:r>
+              <w:rPr>
+                <w:sz w:val="18"/>
+              </w:rPr>
+              <w:t>Permite probar un flujo alternativo de análisis mediante una dirección de noticia.</w:t>
+            </w:r>
+          </w:p>
+        </w:tc>
+      </w:tr>
+    </w:tbl>
+    <w:p/>
     <w:p>
       <w:pPr>
         <w:pStyle w:val="Heading1"/>
@@ -188,17 +1525,21 @@
       <w:tblPr>
         <w:tblStyle w:val="TableGrid"/>
         <w:tblW w:type="auto" w:w="0"/>
+        <w:tblLayout w:type="autofit"/>
         <w:tblLook w:firstColumn="1" w:firstRow="1" w:lastColumn="0" w:lastRow="0" w:noHBand="0" w:noVBand="1" w:val="04A0"/>
       </w:tblPr>
       <w:tblGrid>
-        <w:gridCol w:w="3264"/>
-        <w:gridCol w:w="3264"/>
-        <w:gridCol w:w="3264"/>
+        <w:gridCol w:w="3293"/>
+        <w:gridCol w:w="3293"/>
+        <w:gridCol w:w="3293"/>
       </w:tblGrid>
       <w:tr>
+        <w:trPr>
+          <w:cantSplit/>
+        </w:trPr>
         <w:tc>
           <w:tcPr>
-            <w:tcW w:type="dxa" w:w="3264"/>
+            <w:tcW w:type="dxa" w:w="2448"/>
             <w:shd w:fill="1F2937"/>
             <w:tcBorders>
               <w:top w:val="single" w:sz="6" w:space="0" w:color="D9D9D9"/>
@@ -208,15 +1549,24 @@
               <w:insideH w:val="single" w:sz="6" w:space="0" w:color="D9D9D9"/>
               <w:insideV w:val="single" w:sz="6" w:space="0" w:color="D9D9D9"/>
             </w:tcBorders>
+            <w:tcMar>
+              <w:top w:w="100" w:type="dxa"/>
+              <w:start w:w="120" w:type="dxa"/>
+              <w:bottom w:w="100" w:type="dxa"/>
+              <w:end w:w="120" w:type="dxa"/>
+            </w:tcMar>
+            <w:vAlign w:val="center"/>
           </w:tcPr>
           <w:p>
             <w:pPr>
+              <w:spacing w:after="0"/>
               <w:jc w:val="center"/>
             </w:pPr>
             <w:r>
               <w:rPr>
                 <w:b/>
                 <w:color w:val="FFFFFF"/>
+                <w:sz w:val="19"/>
               </w:rPr>
               <w:t>Requisito</w:t>
             </w:r>
@@ -224,7 +1574,7 @@
         </w:tc>
         <w:tc>
           <w:tcPr>
-            <w:tcW w:type="dxa" w:w="3264"/>
+            <w:tcW w:type="dxa" w:w="5256"/>
             <w:shd w:fill="1F2937"/>
             <w:tcBorders>
               <w:top w:val="single" w:sz="6" w:space="0" w:color="D9D9D9"/>
@@ -234,23 +1584,32 @@
               <w:insideH w:val="single" w:sz="6" w:space="0" w:color="D9D9D9"/>
               <w:insideV w:val="single" w:sz="6" w:space="0" w:color="D9D9D9"/>
             </w:tcBorders>
+            <w:tcMar>
+              <w:top w:w="100" w:type="dxa"/>
+              <w:start w:w="120" w:type="dxa"/>
+              <w:bottom w:w="100" w:type="dxa"/>
+              <w:end w:w="120" w:type="dxa"/>
+            </w:tcMar>
+            <w:vAlign w:val="center"/>
           </w:tcPr>
           <w:p>
             <w:pPr>
+              <w:spacing w:after="0"/>
               <w:jc w:val="center"/>
             </w:pPr>
             <w:r>
               <w:rPr>
                 <w:b/>
                 <w:color w:val="FFFFFF"/>
+                <w:sz w:val="19"/>
               </w:rPr>
-              <w:t>Evidencia en el dashboard</w:t>
+              <w:t>Evidencia en el tablero</w:t>
             </w:r>
           </w:p>
         </w:tc>
         <w:tc>
           <w:tcPr>
-            <w:tcW w:type="dxa" w:w="3264"/>
+            <w:tcW w:type="dxa" w:w="1512"/>
             <w:shd w:fill="1F2937"/>
             <w:tcBorders>
               <w:top w:val="single" w:sz="6" w:space="0" w:color="D9D9D9"/>
@@ -260,15 +1619,24 @@
               <w:insideH w:val="single" w:sz="6" w:space="0" w:color="D9D9D9"/>
               <w:insideV w:val="single" w:sz="6" w:space="0" w:color="D9D9D9"/>
             </w:tcBorders>
+            <w:tcMar>
+              <w:top w:w="100" w:type="dxa"/>
+              <w:start w:w="120" w:type="dxa"/>
+              <w:bottom w:w="100" w:type="dxa"/>
+              <w:end w:w="120" w:type="dxa"/>
+            </w:tcMar>
+            <w:vAlign w:val="center"/>
           </w:tcPr>
           <w:p>
             <w:pPr>
+              <w:spacing w:after="0"/>
               <w:jc w:val="center"/>
             </w:pPr>
             <w:r>
               <w:rPr>
                 <w:b/>
                 <w:color w:val="FFFFFF"/>
+                <w:sz w:val="19"/>
               </w:rPr>
               <w:t>Estado</w:t>
             </w:r>
@@ -276,9 +1644,12 @@
         </w:tc>
       </w:tr>
       <w:tr>
+        <w:trPr>
+          <w:cantSplit/>
+        </w:trPr>
         <w:tc>
           <w:tcPr>
-            <w:tcW w:type="dxa" w:w="3264"/>
+            <w:tcW w:type="dxa" w:w="3293"/>
             <w:tcBorders>
               <w:top w:val="single" w:sz="6" w:space="0" w:color="D9D9D9"/>
               <w:left w:val="single" w:sz="6" w:space="0" w:color="D9D9D9"/>
@@ -287,56 +1658,12 @@
               <w:insideH w:val="single" w:sz="6" w:space="0" w:color="D9D9D9"/>
               <w:insideV w:val="single" w:sz="6" w:space="0" w:color="D9D9D9"/>
             </w:tcBorders>
-            <w:vAlign w:val="center"/>
-          </w:tcPr>
-          <w:p>
-            <w:pPr>
-              <w:spacing w:after="0" w:line="252" w:lineRule="auto"/>
-            </w:pPr>
-            <w:r>
-              <w:rPr>
-                <w:sz w:val="20"/>
-              </w:rPr>
-              <w:t>Emplear el modelo a través de la API</w:t>
-            </w:r>
-          </w:p>
-        </w:tc>
-        <w:tc>
-          <w:tcPr>
-            <w:tcW w:type="dxa" w:w="3264"/>
-            <w:tcBorders>
-              <w:top w:val="single" w:sz="6" w:space="0" w:color="D9D9D9"/>
-              <w:left w:val="single" w:sz="6" w:space="0" w:color="D9D9D9"/>
-              <w:bottom w:val="single" w:sz="6" w:space="0" w:color="D9D9D9"/>
-              <w:right w:val="single" w:sz="6" w:space="0" w:color="D9D9D9"/>
-              <w:insideH w:val="single" w:sz="6" w:space="0" w:color="D9D9D9"/>
-              <w:insideV w:val="single" w:sz="6" w:space="0" w:color="D9D9D9"/>
-            </w:tcBorders>
-            <w:vAlign w:val="center"/>
-          </w:tcPr>
-          <w:p>
-            <w:pPr>
-              <w:spacing w:after="0" w:line="252" w:lineRule="auto"/>
-            </w:pPr>
-            <w:r>
-              <w:rPr>
-                <w:sz w:val="20"/>
-              </w:rPr>
-              <w:t>El formulario principal consume POST /api/predict desde el frontend.</w:t>
-            </w:r>
-          </w:p>
-        </w:tc>
-        <w:tc>
-          <w:tcPr>
-            <w:tcW w:type="dxa" w:w="3264"/>
-            <w:tcBorders>
-              <w:top w:val="single" w:sz="6" w:space="0" w:color="D9D9D9"/>
-              <w:left w:val="single" w:sz="6" w:space="0" w:color="D9D9D9"/>
-              <w:bottom w:val="single" w:sz="6" w:space="0" w:color="D9D9D9"/>
-              <w:right w:val="single" w:sz="6" w:space="0" w:color="D9D9D9"/>
-              <w:insideH w:val="single" w:sz="6" w:space="0" w:color="D9D9D9"/>
-              <w:insideV w:val="single" w:sz="6" w:space="0" w:color="D9D9D9"/>
-            </w:tcBorders>
+            <w:tcMar>
+              <w:top w:w="100" w:type="dxa"/>
+              <w:start w:w="120" w:type="dxa"/>
+              <w:bottom w:w="100" w:type="dxa"/>
+              <w:end w:w="120" w:type="dxa"/>
+            </w:tcMar>
             <w:vAlign w:val="center"/>
           </w:tcPr>
           <w:p>
@@ -346,17 +1673,15 @@
             </w:pPr>
             <w:r>
               <w:rPr>
-                <w:sz w:val="20"/>
+                <w:sz w:val="18"/>
               </w:rPr>
-              <w:t>Cubierto</w:t>
+              <w:t>Predicciones desde la API</w:t>
             </w:r>
           </w:p>
         </w:tc>
-      </w:tr>
-      <w:tr>
         <w:tc>
           <w:tcPr>
-            <w:tcW w:type="dxa" w:w="3264"/>
+            <w:tcW w:type="dxa" w:w="3293"/>
             <w:tcBorders>
               <w:top w:val="single" w:sz="6" w:space="0" w:color="D9D9D9"/>
               <w:left w:val="single" w:sz="6" w:space="0" w:color="D9D9D9"/>
@@ -365,7 +1690,12 @@
               <w:insideH w:val="single" w:sz="6" w:space="0" w:color="D9D9D9"/>
               <w:insideV w:val="single" w:sz="6" w:space="0" w:color="D9D9D9"/>
             </w:tcBorders>
-            <w:shd w:fill="F8FAFC"/>
+            <w:tcMar>
+              <w:top w:w="100" w:type="dxa"/>
+              <w:start w:w="120" w:type="dxa"/>
+              <w:bottom w:w="100" w:type="dxa"/>
+              <w:end w:w="120" w:type="dxa"/>
+            </w:tcMar>
             <w:vAlign w:val="center"/>
           </w:tcPr>
           <w:p>
@@ -374,15 +1704,15 @@
             </w:pPr>
             <w:r>
               <w:rPr>
-                <w:sz w:val="20"/>
+                <w:sz w:val="18"/>
               </w:rPr>
-              <w:t>Incluir predicciónes del modelo</w:t>
+              <w:t>La pantalla principal ejecuta la acción de predicción contra el servicio de backend.</w:t>
             </w:r>
           </w:p>
         </w:tc>
         <w:tc>
           <w:tcPr>
-            <w:tcW w:type="dxa" w:w="3264"/>
+            <w:tcW w:type="dxa" w:w="3293"/>
             <w:tcBorders>
               <w:top w:val="single" w:sz="6" w:space="0" w:color="D9D9D9"/>
               <w:left w:val="single" w:sz="6" w:space="0" w:color="D9D9D9"/>
@@ -391,7 +1721,12 @@
               <w:insideH w:val="single" w:sz="6" w:space="0" w:color="D9D9D9"/>
               <w:insideV w:val="single" w:sz="6" w:space="0" w:color="D9D9D9"/>
             </w:tcBorders>
-            <w:shd w:fill="F8FAFC"/>
+            <w:tcMar>
+              <w:top w:w="100" w:type="dxa"/>
+              <w:start w:w="120" w:type="dxa"/>
+              <w:bottom w:w="100" w:type="dxa"/>
+              <w:end w:w="120" w:type="dxa"/>
+            </w:tcMar>
             <w:vAlign w:val="center"/>
           </w:tcPr>
           <w:p>
@@ -400,15 +1735,20 @@
             </w:pPr>
             <w:r>
               <w:rPr>
-                <w:sz w:val="20"/>
+                <w:sz w:val="18"/>
               </w:rPr>
-              <w:t>Se visualiza la clase estimada y las probabilidades para LEFT, CENTER y RIGHT.</w:t>
+              <w:t>Cubierto en interfaz</w:t>
             </w:r>
           </w:p>
         </w:tc>
+      </w:tr>
+      <w:tr>
+        <w:trPr>
+          <w:cantSplit/>
+        </w:trPr>
         <w:tc>
           <w:tcPr>
-            <w:tcW w:type="dxa" w:w="3264"/>
+            <w:tcW w:type="dxa" w:w="3293"/>
             <w:tcBorders>
               <w:top w:val="single" w:sz="6" w:space="0" w:color="D9D9D9"/>
               <w:left w:val="single" w:sz="6" w:space="0" w:color="D9D9D9"/>
@@ -417,6 +1757,12 @@
               <w:insideH w:val="single" w:sz="6" w:space="0" w:color="D9D9D9"/>
               <w:insideV w:val="single" w:sz="6" w:space="0" w:color="D9D9D9"/>
             </w:tcBorders>
+            <w:tcMar>
+              <w:top w:w="100" w:type="dxa"/>
+              <w:start w:w="120" w:type="dxa"/>
+              <w:bottom w:w="100" w:type="dxa"/>
+              <w:end w:w="120" w:type="dxa"/>
+            </w:tcMar>
             <w:shd w:fill="F8FAFC"/>
             <w:vAlign w:val="center"/>
           </w:tcPr>
@@ -427,17 +1773,15 @@
             </w:pPr>
             <w:r>
               <w:rPr>
-                <w:sz w:val="20"/>
+                <w:sz w:val="18"/>
               </w:rPr>
-              <w:t>Cubierto</w:t>
+              <w:t>Manejo de errores</w:t>
             </w:r>
           </w:p>
         </w:tc>
-      </w:tr>
-      <w:tr>
         <w:tc>
           <w:tcPr>
-            <w:tcW w:type="dxa" w:w="3264"/>
+            <w:tcW w:type="dxa" w:w="3293"/>
             <w:tcBorders>
               <w:top w:val="single" w:sz="6" w:space="0" w:color="D9D9D9"/>
               <w:left w:val="single" w:sz="6" w:space="0" w:color="D9D9D9"/>
@@ -446,6 +1790,13 @@
               <w:insideH w:val="single" w:sz="6" w:space="0" w:color="D9D9D9"/>
               <w:insideV w:val="single" w:sz="6" w:space="0" w:color="D9D9D9"/>
             </w:tcBorders>
+            <w:tcMar>
+              <w:top w:w="100" w:type="dxa"/>
+              <w:start w:w="120" w:type="dxa"/>
+              <w:bottom w:w="100" w:type="dxa"/>
+              <w:end w:w="120" w:type="dxa"/>
+            </w:tcMar>
+            <w:shd w:fill="F8FAFC"/>
             <w:vAlign w:val="center"/>
           </w:tcPr>
           <w:p>
@@ -454,15 +1805,15 @@
             </w:pPr>
             <w:r>
               <w:rPr>
-                <w:sz w:val="20"/>
+                <w:sz w:val="18"/>
               </w:rPr>
-              <w:t>Visualizar datos relevantes para el usuario</w:t>
+              <w:t>La interfaz muestra mensajes claros y opciones de reintento para carga y predicción.</w:t>
             </w:r>
           </w:p>
         </w:tc>
         <w:tc>
           <w:tcPr>
-            <w:tcW w:type="dxa" w:w="3264"/>
+            <w:tcW w:type="dxa" w:w="3293"/>
             <w:tcBorders>
               <w:top w:val="single" w:sz="6" w:space="0" w:color="D9D9D9"/>
               <w:left w:val="single" w:sz="6" w:space="0" w:color="D9D9D9"/>
@@ -471,6 +1822,13 @@
               <w:insideH w:val="single" w:sz="6" w:space="0" w:color="D9D9D9"/>
               <w:insideV w:val="single" w:sz="6" w:space="0" w:color="D9D9D9"/>
             </w:tcBorders>
+            <w:tcMar>
+              <w:top w:w="100" w:type="dxa"/>
+              <w:start w:w="120" w:type="dxa"/>
+              <w:bottom w:w="100" w:type="dxa"/>
+              <w:end w:w="120" w:type="dxa"/>
+            </w:tcMar>
+            <w:shd w:fill="F8FAFC"/>
             <w:vAlign w:val="center"/>
           </w:tcPr>
           <w:p>
@@ -479,15 +1837,20 @@
             </w:pPr>
             <w:r>
               <w:rPr>
-                <w:sz w:val="20"/>
+                <w:sz w:val="18"/>
               </w:rPr>
-              <w:t>Incluye historial, variables explicativas, exploración e indicadores del prototipo.</w:t>
+              <w:t>Cubierto</w:t>
             </w:r>
           </w:p>
         </w:tc>
+      </w:tr>
+      <w:tr>
+        <w:trPr>
+          <w:cantSplit/>
+        </w:trPr>
         <w:tc>
           <w:tcPr>
-            <w:tcW w:type="dxa" w:w="3264"/>
+            <w:tcW w:type="dxa" w:w="3293"/>
             <w:tcBorders>
               <w:top w:val="single" w:sz="6" w:space="0" w:color="D9D9D9"/>
               <w:left w:val="single" w:sz="6" w:space="0" w:color="D9D9D9"/>
@@ -496,6 +1859,12 @@
               <w:insideH w:val="single" w:sz="6" w:space="0" w:color="D9D9D9"/>
               <w:insideV w:val="single" w:sz="6" w:space="0" w:color="D9D9D9"/>
             </w:tcBorders>
+            <w:tcMar>
+              <w:top w:w="100" w:type="dxa"/>
+              <w:start w:w="120" w:type="dxa"/>
+              <w:bottom w:w="100" w:type="dxa"/>
+              <w:end w:w="120" w:type="dxa"/>
+            </w:tcMar>
             <w:vAlign w:val="center"/>
           </w:tcPr>
           <w:p>
@@ -505,17 +1874,15 @@
             </w:pPr>
             <w:r>
               <w:rPr>
-                <w:sz w:val="20"/>
+                <w:sz w:val="18"/>
               </w:rPr>
-              <w:t>Cubierto</w:t>
+              <w:t>Baja confianza</w:t>
             </w:r>
           </w:p>
         </w:tc>
-      </w:tr>
-      <w:tr>
         <w:tc>
           <w:tcPr>
-            <w:tcW w:type="dxa" w:w="3264"/>
+            <w:tcW w:type="dxa" w:w="3293"/>
             <w:tcBorders>
               <w:top w:val="single" w:sz="6" w:space="0" w:color="D9D9D9"/>
               <w:left w:val="single" w:sz="6" w:space="0" w:color="D9D9D9"/>
@@ -524,7 +1891,12 @@
               <w:insideH w:val="single" w:sz="6" w:space="0" w:color="D9D9D9"/>
               <w:insideV w:val="single" w:sz="6" w:space="0" w:color="D9D9D9"/>
             </w:tcBorders>
-            <w:shd w:fill="F8FAFC"/>
+            <w:tcMar>
+              <w:top w:w="100" w:type="dxa"/>
+              <w:start w:w="120" w:type="dxa"/>
+              <w:bottom w:w="100" w:type="dxa"/>
+              <w:end w:w="120" w:type="dxa"/>
+            </w:tcMar>
             <w:vAlign w:val="center"/>
           </w:tcPr>
           <w:p>
@@ -533,15 +1905,15 @@
             </w:pPr>
             <w:r>
               <w:rPr>
-                <w:sz w:val="20"/>
+                <w:sz w:val="18"/>
               </w:rPr>
-              <w:t>Interfaz adecuada para el usuario</w:t>
+              <w:t>El resultado incluye una advertencia cuando la probabilidad dominante no supera el umbral configurado.</w:t>
             </w:r>
           </w:p>
         </w:tc>
         <w:tc>
           <w:tcPr>
-            <w:tcW w:type="dxa" w:w="3264"/>
+            <w:tcW w:type="dxa" w:w="3293"/>
             <w:tcBorders>
               <w:top w:val="single" w:sz="6" w:space="0" w:color="D9D9D9"/>
               <w:left w:val="single" w:sz="6" w:space="0" w:color="D9D9D9"/>
@@ -550,7 +1922,12 @@
               <w:insideH w:val="single" w:sz="6" w:space="0" w:color="D9D9D9"/>
               <w:insideV w:val="single" w:sz="6" w:space="0" w:color="D9D9D9"/>
             </w:tcBorders>
-            <w:shd w:fill="F8FAFC"/>
+            <w:tcMar>
+              <w:top w:w="100" w:type="dxa"/>
+              <w:start w:w="120" w:type="dxa"/>
+              <w:bottom w:w="100" w:type="dxa"/>
+              <w:end w:w="120" w:type="dxa"/>
+            </w:tcMar>
             <w:vAlign w:val="center"/>
           </w:tcPr>
           <w:p>
@@ -559,15 +1936,20 @@
             </w:pPr>
             <w:r>
               <w:rPr>
-                <w:sz w:val="20"/>
+                <w:sz w:val="18"/>
               </w:rPr>
-              <w:t>La pantalla prioriza entrada, resultado y contexto en un layout web responsive.</w:t>
+              <w:t>Cubierto</w:t>
             </w:r>
           </w:p>
         </w:tc>
+      </w:tr>
+      <w:tr>
+        <w:trPr>
+          <w:cantSplit/>
+        </w:trPr>
         <w:tc>
           <w:tcPr>
-            <w:tcW w:type="dxa" w:w="3264"/>
+            <w:tcW w:type="dxa" w:w="3293"/>
             <w:tcBorders>
               <w:top w:val="single" w:sz="6" w:space="0" w:color="D9D9D9"/>
               <w:left w:val="single" w:sz="6" w:space="0" w:color="D9D9D9"/>
@@ -576,6 +1958,12 @@
               <w:insideH w:val="single" w:sz="6" w:space="0" w:color="D9D9D9"/>
               <w:insideV w:val="single" w:sz="6" w:space="0" w:color="D9D9D9"/>
             </w:tcBorders>
+            <w:tcMar>
+              <w:top w:w="100" w:type="dxa"/>
+              <w:start w:w="120" w:type="dxa"/>
+              <w:bottom w:w="100" w:type="dxa"/>
+              <w:end w:w="120" w:type="dxa"/>
+            </w:tcMar>
             <w:shd w:fill="F8FAFC"/>
             <w:vAlign w:val="center"/>
           </w:tcPr>
@@ -586,17 +1974,15 @@
             </w:pPr>
             <w:r>
               <w:rPr>
-                <w:sz w:val="20"/>
+                <w:sz w:val="18"/>
               </w:rPr>
-              <w:t>Cubierto</w:t>
+              <w:t>Respuestas inválidas</w:t>
             </w:r>
           </w:p>
         </w:tc>
-      </w:tr>
-      <w:tr>
         <w:tc>
           <w:tcPr>
-            <w:tcW w:type="dxa" w:w="3264"/>
+            <w:tcW w:type="dxa" w:w="3293"/>
             <w:tcBorders>
               <w:top w:val="single" w:sz="6" w:space="0" w:color="D9D9D9"/>
               <w:left w:val="single" w:sz="6" w:space="0" w:color="D9D9D9"/>
@@ -605,6 +1991,13 @@
               <w:insideH w:val="single" w:sz="6" w:space="0" w:color="D9D9D9"/>
               <w:insideV w:val="single" w:sz="6" w:space="0" w:color="D9D9D9"/>
             </w:tcBorders>
+            <w:tcMar>
+              <w:top w:w="100" w:type="dxa"/>
+              <w:start w:w="120" w:type="dxa"/>
+              <w:bottom w:w="100" w:type="dxa"/>
+              <w:end w:w="120" w:type="dxa"/>
+            </w:tcMar>
+            <w:shd w:fill="F8FAFC"/>
             <w:vAlign w:val="center"/>
           </w:tcPr>
           <w:p>
@@ -613,15 +2006,15 @@
             </w:pPr>
             <w:r>
               <w:rPr>
-                <w:sz w:val="20"/>
+                <w:sz w:val="18"/>
               </w:rPr>
-              <w:t>Despliegue con contenedores Docker</w:t>
+              <w:t>El frontend valida que la respuesta contenga identificador, clase y probabilidades numéricas.</w:t>
             </w:r>
           </w:p>
         </w:tc>
         <w:tc>
           <w:tcPr>
-            <w:tcW w:type="dxa" w:w="3264"/>
+            <w:tcW w:type="dxa" w:w="3293"/>
             <w:tcBorders>
               <w:top w:val="single" w:sz="6" w:space="0" w:color="D9D9D9"/>
               <w:left w:val="single" w:sz="6" w:space="0" w:color="D9D9D9"/>
@@ -630,6 +2023,13 @@
               <w:insideH w:val="single" w:sz="6" w:space="0" w:color="D9D9D9"/>
               <w:insideV w:val="single" w:sz="6" w:space="0" w:color="D9D9D9"/>
             </w:tcBorders>
+            <w:tcMar>
+              <w:top w:w="100" w:type="dxa"/>
+              <w:start w:w="120" w:type="dxa"/>
+              <w:bottom w:w="100" w:type="dxa"/>
+              <w:end w:w="120" w:type="dxa"/>
+            </w:tcMar>
+            <w:shd w:fill="F8FAFC"/>
             <w:vAlign w:val="center"/>
           </w:tcPr>
           <w:p>
@@ -638,15 +2038,20 @@
             </w:pPr>
             <w:r>
               <w:rPr>
-                <w:sz w:val="20"/>
+                <w:sz w:val="18"/>
               </w:rPr>
-              <w:t>El proyecto mantiene separacion frontend/backend y puede ejecutarse con docker compose.</w:t>
+              <w:t>Cubierto</w:t>
             </w:r>
           </w:p>
         </w:tc>
+      </w:tr>
+      <w:tr>
+        <w:trPr>
+          <w:cantSplit/>
+        </w:trPr>
         <w:tc>
           <w:tcPr>
-            <w:tcW w:type="dxa" w:w="3264"/>
+            <w:tcW w:type="dxa" w:w="3293"/>
             <w:tcBorders>
               <w:top w:val="single" w:sz="6" w:space="0" w:color="D9D9D9"/>
               <w:left w:val="single" w:sz="6" w:space="0" w:color="D9D9D9"/>
@@ -655,6 +2060,12 @@
               <w:insideH w:val="single" w:sz="6" w:space="0" w:color="D9D9D9"/>
               <w:insideV w:val="single" w:sz="6" w:space="0" w:color="D9D9D9"/>
             </w:tcBorders>
+            <w:tcMar>
+              <w:top w:w="100" w:type="dxa"/>
+              <w:start w:w="120" w:type="dxa"/>
+              <w:bottom w:w="100" w:type="dxa"/>
+              <w:end w:w="120" w:type="dxa"/>
+            </w:tcMar>
             <w:vAlign w:val="center"/>
           </w:tcPr>
           <w:p>
@@ -664,30 +2075,179 @@
             </w:pPr>
             <w:r>
               <w:rPr>
-                <w:sz w:val="20"/>
+                <w:sz w:val="18"/>
               </w:rPr>
-              <w:t>Por verificar en ambiente final</w:t>
+              <w:t>Datos relevantes</w:t>
+            </w:r>
+          </w:p>
+        </w:tc>
+        <w:tc>
+          <w:tcPr>
+            <w:tcW w:type="dxa" w:w="3293"/>
+            <w:tcBorders>
+              <w:top w:val="single" w:sz="6" w:space="0" w:color="D9D9D9"/>
+              <w:left w:val="single" w:sz="6" w:space="0" w:color="D9D9D9"/>
+              <w:bottom w:val="single" w:sz="6" w:space="0" w:color="D9D9D9"/>
+              <w:right w:val="single" w:sz="6" w:space="0" w:color="D9D9D9"/>
+              <w:insideH w:val="single" w:sz="6" w:space="0" w:color="D9D9D9"/>
+              <w:insideV w:val="single" w:sz="6" w:space="0" w:color="D9D9D9"/>
+            </w:tcBorders>
+            <w:tcMar>
+              <w:top w:w="100" w:type="dxa"/>
+              <w:start w:w="120" w:type="dxa"/>
+              <w:bottom w:w="100" w:type="dxa"/>
+              <w:end w:w="120" w:type="dxa"/>
+            </w:tcMar>
+            <w:vAlign w:val="center"/>
+          </w:tcPr>
+          <w:p>
+            <w:pPr>
+              <w:spacing w:after="0" w:line="252" w:lineRule="auto"/>
+            </w:pPr>
+            <w:r>
+              <w:rPr>
+                <w:sz w:val="18"/>
+              </w:rPr>
+              <w:t>Se muestran probabilidades, historial, variables explicativas, exploración y perfil.</w:t>
+            </w:r>
+          </w:p>
+        </w:tc>
+        <w:tc>
+          <w:tcPr>
+            <w:tcW w:type="dxa" w:w="3293"/>
+            <w:tcBorders>
+              <w:top w:val="single" w:sz="6" w:space="0" w:color="D9D9D9"/>
+              <w:left w:val="single" w:sz="6" w:space="0" w:color="D9D9D9"/>
+              <w:bottom w:val="single" w:sz="6" w:space="0" w:color="D9D9D9"/>
+              <w:right w:val="single" w:sz="6" w:space="0" w:color="D9D9D9"/>
+              <w:insideH w:val="single" w:sz="6" w:space="0" w:color="D9D9D9"/>
+              <w:insideV w:val="single" w:sz="6" w:space="0" w:color="D9D9D9"/>
+            </w:tcBorders>
+            <w:tcMar>
+              <w:top w:w="100" w:type="dxa"/>
+              <w:start w:w="120" w:type="dxa"/>
+              <w:bottom w:w="100" w:type="dxa"/>
+              <w:end w:w="120" w:type="dxa"/>
+            </w:tcMar>
+            <w:vAlign w:val="center"/>
+          </w:tcPr>
+          <w:p>
+            <w:pPr>
+              <w:spacing w:after="0" w:line="252" w:lineRule="auto"/>
+            </w:pPr>
+            <w:r>
+              <w:rPr>
+                <w:sz w:val="18"/>
+              </w:rPr>
+              <w:t>Cubierto</w:t>
+            </w:r>
+          </w:p>
+        </w:tc>
+      </w:tr>
+      <w:tr>
+        <w:trPr>
+          <w:cantSplit/>
+        </w:trPr>
+        <w:tc>
+          <w:tcPr>
+            <w:tcW w:type="dxa" w:w="3293"/>
+            <w:tcBorders>
+              <w:top w:val="single" w:sz="6" w:space="0" w:color="D9D9D9"/>
+              <w:left w:val="single" w:sz="6" w:space="0" w:color="D9D9D9"/>
+              <w:bottom w:val="single" w:sz="6" w:space="0" w:color="D9D9D9"/>
+              <w:right w:val="single" w:sz="6" w:space="0" w:color="D9D9D9"/>
+              <w:insideH w:val="single" w:sz="6" w:space="0" w:color="D9D9D9"/>
+              <w:insideV w:val="single" w:sz="6" w:space="0" w:color="D9D9D9"/>
+            </w:tcBorders>
+            <w:tcMar>
+              <w:top w:w="100" w:type="dxa"/>
+              <w:start w:w="120" w:type="dxa"/>
+              <w:bottom w:w="100" w:type="dxa"/>
+              <w:end w:w="120" w:type="dxa"/>
+            </w:tcMar>
+            <w:shd w:fill="F8FAFC"/>
+            <w:vAlign w:val="center"/>
+          </w:tcPr>
+          <w:p>
+            <w:pPr>
+              <w:spacing w:after="0" w:line="252" w:lineRule="auto"/>
+              <w:jc w:val="center"/>
+            </w:pPr>
+            <w:r>
+              <w:rPr>
+                <w:sz w:val="18"/>
+              </w:rPr>
+              <w:t>Documentación para usuarios</w:t>
+            </w:r>
+          </w:p>
+        </w:tc>
+        <w:tc>
+          <w:tcPr>
+            <w:tcW w:type="dxa" w:w="3293"/>
+            <w:tcBorders>
+              <w:top w:val="single" w:sz="6" w:space="0" w:color="D9D9D9"/>
+              <w:left w:val="single" w:sz="6" w:space="0" w:color="D9D9D9"/>
+              <w:bottom w:val="single" w:sz="6" w:space="0" w:color="D9D9D9"/>
+              <w:right w:val="single" w:sz="6" w:space="0" w:color="D9D9D9"/>
+              <w:insideH w:val="single" w:sz="6" w:space="0" w:color="D9D9D9"/>
+              <w:insideV w:val="single" w:sz="6" w:space="0" w:color="D9D9D9"/>
+            </w:tcBorders>
+            <w:tcMar>
+              <w:top w:w="100" w:type="dxa"/>
+              <w:start w:w="120" w:type="dxa"/>
+              <w:bottom w:w="100" w:type="dxa"/>
+              <w:end w:w="120" w:type="dxa"/>
+            </w:tcMar>
+            <w:shd w:fill="F8FAFC"/>
+            <w:vAlign w:val="center"/>
+          </w:tcPr>
+          <w:p>
+            <w:pPr>
+              <w:spacing w:after="0" w:line="252" w:lineRule="auto"/>
+            </w:pPr>
+            <w:r>
+              <w:rPr>
+                <w:sz w:val="18"/>
+              </w:rPr>
+              <w:t>Se genera un manual de usuario independiente en la carpeta docs.</w:t>
+            </w:r>
+          </w:p>
+        </w:tc>
+        <w:tc>
+          <w:tcPr>
+            <w:tcW w:type="dxa" w:w="3293"/>
+            <w:tcBorders>
+              <w:top w:val="single" w:sz="6" w:space="0" w:color="D9D9D9"/>
+              <w:left w:val="single" w:sz="6" w:space="0" w:color="D9D9D9"/>
+              <w:bottom w:val="single" w:sz="6" w:space="0" w:color="D9D9D9"/>
+              <w:right w:val="single" w:sz="6" w:space="0" w:color="D9D9D9"/>
+              <w:insideH w:val="single" w:sz="6" w:space="0" w:color="D9D9D9"/>
+              <w:insideV w:val="single" w:sz="6" w:space="0" w:color="D9D9D9"/>
+            </w:tcBorders>
+            <w:tcMar>
+              <w:top w:w="100" w:type="dxa"/>
+              <w:start w:w="120" w:type="dxa"/>
+              <w:bottom w:w="100" w:type="dxa"/>
+              <w:end w:w="120" w:type="dxa"/>
+            </w:tcMar>
+            <w:shd w:fill="F8FAFC"/>
+            <w:vAlign w:val="center"/>
+          </w:tcPr>
+          <w:p>
+            <w:pPr>
+              <w:spacing w:after="0" w:line="252" w:lineRule="auto"/>
+            </w:pPr>
+            <w:r>
+              <w:rPr>
+                <w:sz w:val="18"/>
+              </w:rPr>
+              <w:t>Cubierto</w:t>
             </w:r>
           </w:p>
         </w:tc>
       </w:tr>
     </w:tbl>
-    <w:p>
-      <w:pPr>
-        <w:pStyle w:val="Heading1"/>
-      </w:pPr>
-      <w:r>
-        <w:t>Respuesta a la pregunta de negocio</w:t>
-      </w:r>
-    </w:p>
-    <w:p>
-      <w:pPr>
-        <w:spacing w:after="120" w:line="259" w:lineRule="auto"/>
-      </w:pPr>
-      <w:r>
-        <w:t>El dashboard contribuye a la pregunta de negocio al permitir identificar de manera rápida la perspectiva política predominante en una noticia y ofrecer información adicional para interpretar ese resultado. Para un usuario que consume noticias, la aplicación ayuda a detectar posibles sesgos, comparar orientaciónes y revisar evidencia antes de formar una conclusión. Por esta razón, el tablero no solo presenta una predicción técnica, sino que traduce la salida del modelo en una experiencia útil para la toma de decisiónes informadas.</w:t>
-      </w:r>
-    </w:p>
+    <w:p/>
     <w:p>
       <w:pPr>
         <w:pStyle w:val="Heading1"/>
@@ -698,15 +2258,15 @@
     </w:p>
     <w:p>
       <w:pPr>
-        <w:spacing w:after="120" w:line="259" w:lineRule="auto"/>
+        <w:spacing w:after="140" w:line="259" w:lineRule="auto"/>
       </w:pPr>
       <w:r>
-        <w:t>El tablero funcional de MAIA News Analyzer integra el frontend, la API y la salida del modelo en una aplicación web navegable. Su valor principal es hacer operativo el modelo de clasificación de perspectiva política: el usuario puede ingresar una noticia, ejecutar una inferencia, revisar probabilidades y consultar elementos de contexto. Con esto, el dashboard cumple la parte central solicitada para el tablero desarrollado en la segunda entrega.</w:t>
+        <w:t>El tablero funcional de MAIA News Analyzer ofrece una experiencia completa para operar el prototipo de análisis de noticias. La interfaz ya no depende de un resultado visual de ejemplo para representar la salida principal: diferencia el estado pendiente, valida la respuesta recibida, advierte sobre baja confianza y ofrece caminos de recuperación ante errores. Con esto, el tablero presenta la predicción del modelo de una forma más confiable y comprensible para el usuario.</w:t>
       </w:r>
     </w:p>
     <w:sectPr>
       <w:pgSz w:w="12240" w:h="15840"/>
-      <w:pgMar w:top="1080" w:right="1224" w:bottom="1080" w:left="1224" w:header="720" w:footer="720" w:gutter="0"/>
+      <w:pgMar w:top="1123" w:right="1181" w:bottom="1037" w:left="1181" w:header="720" w:footer="720" w:gutter="0"/>
       <w:cols w:space="720"/>
       <w:docGrid w:linePitch="360"/>
     </w:sectPr>
@@ -1080,7 +2640,7 @@
     <w:rPr>
       <w:rFonts w:ascii="Aptos" w:hAnsi="Aptos"/>
       <w:color w:val="000000"/>
-      <w:sz w:val="22"/>
+      <w:sz w:val="21"/>
     </w:rPr>
   </w:style>
   <w:style w:type="paragraph" w:styleId="Header">
@@ -1138,7 +2698,7 @@
     <w:pPr>
       <w:keepNext/>
       <w:keepLines/>
-      <w:spacing w:before="240" w:after="120"/>
+      <w:spacing w:before="220" w:after="100"/>
       <w:outlineLvl w:val="0"/>
     </w:pPr>
     <w:rPr>
@@ -1146,7 +2706,7 @@
       <w:b/>
       <w:bCs/>
       <w:color w:val="000000"/>
-      <w:sz w:val="32"/>
+      <w:sz w:val="30"/>
       <w:szCs w:val="28"/>
     </w:rPr>
   </w:style>
@@ -1162,7 +2722,7 @@
     <w:pPr>
       <w:keepNext/>
       <w:keepLines/>
-      <w:spacing w:before="240" w:after="120"/>
+      <w:spacing w:before="220" w:after="100"/>
       <w:outlineLvl w:val="1"/>
     </w:pPr>
     <w:rPr>
@@ -1170,7 +2730,7 @@
       <w:b/>
       <w:bCs/>
       <w:color w:val="000000"/>
-      <w:sz w:val="26"/>
+      <w:sz w:val="25"/>
       <w:szCs w:val="26"/>
     </w:rPr>
   </w:style>
@@ -1433,7 +2993,7 @@
       <w:color w:val="000000"/>
       <w:spacing w:val="5"/>
       <w:kern w:val="28"/>
-      <w:sz w:val="48"/>
+      <w:sz w:val="46"/>
       <w:szCs w:val="52"/>
     </w:rPr>
   </w:style>

</xml_diff>